<commit_message>
yarebi tkon akhir mera
</commit_message>
<xml_diff>
--- a/rapport/pfe-rapport.docx
+++ b/rapport/pfe-rapport.docx
@@ -1028,7 +1028,7 @@
               <w:u w:val="single"/>
             </w:rPr>
           </w:pPr>
-          <w:bookmarkStart w:id="0" w:name="_Toc226240743"/>
+          <w:bookmarkStart w:id="0" w:name="_Toc226412964"/>
           <w:proofErr w:type="spellStart"/>
           <w:r>
             <w:rPr>
@@ -1077,7 +1077,7 @@
             </w:rPr>
             <w:fldChar w:fldCharType="separate"/>
           </w:r>
-          <w:hyperlink w:anchor="_Toc226240743" w:history="1">
+          <w:hyperlink w:anchor="_Toc226412964" w:history="1">
             <w:r>
               <w:rPr>
                 <w:rStyle w:val="Hyperlink"/>
@@ -1110,7 +1110,7 @@
                 <w:noProof/>
                 <w:webHidden/>
               </w:rPr>
-              <w:instrText xml:space="preserve"> PAGEREF _Toc226240743 \h </w:instrText>
+              <w:instrText xml:space="preserve"> PAGEREF _Toc226412964 \h </w:instrText>
             </w:r>
             <w:r>
               <w:rPr>
@@ -1155,7 +1155,7 @@
               <w:lang w:eastAsia="fr-FR"/>
             </w:rPr>
           </w:pPr>
-          <w:hyperlink w:anchor="_Toc226240744" w:history="1">
+          <w:hyperlink w:anchor="_Toc226412965" w:history="1">
             <w:r>
               <w:rPr>
                 <w:rStyle w:val="Hyperlink"/>
@@ -1185,7 +1185,7 @@
                 <w:noProof/>
                 <w:webHidden/>
               </w:rPr>
-              <w:instrText xml:space="preserve"> PAGEREF _Toc226240744 \h </w:instrText>
+              <w:instrText xml:space="preserve"> PAGEREF _Toc226412965 \h </w:instrText>
             </w:r>
             <w:r>
               <w:rPr>
@@ -1230,7 +1230,7 @@
               <w:lang w:eastAsia="fr-FR"/>
             </w:rPr>
           </w:pPr>
-          <w:hyperlink w:anchor="_Toc226240745" w:history="1">
+          <w:hyperlink w:anchor="_Toc226412966" w:history="1">
             <w:r>
               <w:rPr>
                 <w:rStyle w:val="Hyperlink"/>
@@ -1260,7 +1260,7 @@
                 <w:noProof/>
                 <w:webHidden/>
               </w:rPr>
-              <w:instrText xml:space="preserve"> PAGEREF _Toc226240745 \h </w:instrText>
+              <w:instrText xml:space="preserve"> PAGEREF _Toc226412966 \h </w:instrText>
             </w:r>
             <w:r>
               <w:rPr>
@@ -1305,7 +1305,7 @@
               <w:lang w:eastAsia="fr-FR"/>
             </w:rPr>
           </w:pPr>
-          <w:hyperlink w:anchor="_Toc226240746" w:history="1">
+          <w:hyperlink w:anchor="_Toc226412967" w:history="1">
             <w:r>
               <w:rPr>
                 <w:rStyle w:val="Hyperlink"/>
@@ -1335,7 +1335,7 @@
                 <w:noProof/>
                 <w:webHidden/>
               </w:rPr>
-              <w:instrText xml:space="preserve"> PAGEREF _Toc226240746 \h </w:instrText>
+              <w:instrText xml:space="preserve"> PAGEREF _Toc226412967 \h </w:instrText>
             </w:r>
             <w:r>
               <w:rPr>
@@ -1380,7 +1380,7 @@
               <w:lang w:eastAsia="fr-FR"/>
             </w:rPr>
           </w:pPr>
-          <w:hyperlink w:anchor="_Toc226240747" w:history="1">
+          <w:hyperlink w:anchor="_Toc226412968" w:history="1">
             <w:r>
               <w:rPr>
                 <w:rStyle w:val="Hyperlink"/>
@@ -1410,7 +1410,7 @@
                 <w:noProof/>
                 <w:webHidden/>
               </w:rPr>
-              <w:instrText xml:space="preserve"> PAGEREF _Toc226240747 \h </w:instrText>
+              <w:instrText xml:space="preserve"> PAGEREF _Toc226412968 \h </w:instrText>
             </w:r>
             <w:r>
               <w:rPr>
@@ -1455,7 +1455,7 @@
               <w:lang w:eastAsia="fr-FR"/>
             </w:rPr>
           </w:pPr>
-          <w:hyperlink w:anchor="_Toc226240748" w:history="1">
+          <w:hyperlink w:anchor="_Toc226412969" w:history="1">
             <w:r>
               <w:rPr>
                 <w:rStyle w:val="Hyperlink"/>
@@ -1485,7 +1485,7 @@
                 <w:noProof/>
                 <w:webHidden/>
               </w:rPr>
-              <w:instrText xml:space="preserve"> PAGEREF _Toc226240748 \h </w:instrText>
+              <w:instrText xml:space="preserve"> PAGEREF _Toc226412969 \h </w:instrText>
             </w:r>
             <w:r>
               <w:rPr>
@@ -1505,7 +1505,7 @@
                 <w:noProof/>
                 <w:webHidden/>
               </w:rPr>
-              <w:t>10</w:t>
+              <w:t>9</w:t>
             </w:r>
             <w:r>
               <w:rPr>
@@ -1531,7 +1531,7 @@
               <w:lang w:eastAsia="fr-FR"/>
             </w:rPr>
           </w:pPr>
-          <w:hyperlink w:anchor="_Toc226240749" w:history="1">
+          <w:hyperlink w:anchor="_Toc226412970" w:history="1">
             <w:r>
               <w:rPr>
                 <w:rStyle w:val="Hyperlink"/>
@@ -1577,7 +1577,7 @@
                 <w:noProof/>
                 <w:webHidden/>
               </w:rPr>
-              <w:instrText xml:space="preserve"> PAGEREF _Toc226240749 \h </w:instrText>
+              <w:instrText xml:space="preserve"> PAGEREF _Toc226412970 \h </w:instrText>
             </w:r>
             <w:r>
               <w:rPr>
@@ -1597,7 +1597,7 @@
                 <w:noProof/>
                 <w:webHidden/>
               </w:rPr>
-              <w:t>10</w:t>
+              <w:t>9</w:t>
             </w:r>
             <w:r>
               <w:rPr>
@@ -1623,7 +1623,7 @@
               <w:lang w:eastAsia="fr-FR"/>
             </w:rPr>
           </w:pPr>
-          <w:hyperlink w:anchor="_Toc226240750" w:history="1">
+          <w:hyperlink w:anchor="_Toc226412971" w:history="1">
             <w:r>
               <w:rPr>
                 <w:rStyle w:val="Hyperlink"/>
@@ -1669,7 +1669,7 @@
                 <w:noProof/>
                 <w:webHidden/>
               </w:rPr>
-              <w:instrText xml:space="preserve"> PAGEREF _Toc226240750 \h </w:instrText>
+              <w:instrText xml:space="preserve"> PAGEREF _Toc226412971 \h </w:instrText>
             </w:r>
             <w:r>
               <w:rPr>
@@ -1715,7 +1715,7 @@
               <w:lang w:eastAsia="fr-FR"/>
             </w:rPr>
           </w:pPr>
-          <w:hyperlink w:anchor="_Toc226240751" w:history="1">
+          <w:hyperlink w:anchor="_Toc226412972" w:history="1">
             <w:r>
               <w:rPr>
                 <w:rStyle w:val="Hyperlink"/>
@@ -1761,7 +1761,7 @@
                 <w:noProof/>
                 <w:webHidden/>
               </w:rPr>
-              <w:instrText xml:space="preserve"> PAGEREF _Toc226240751 \h </w:instrText>
+              <w:instrText xml:space="preserve"> PAGEREF _Toc226412972 \h </w:instrText>
             </w:r>
             <w:r>
               <w:rPr>
@@ -1807,7 +1807,7 @@
               <w:lang w:eastAsia="fr-FR"/>
             </w:rPr>
           </w:pPr>
-          <w:hyperlink w:anchor="_Toc226240752" w:history="1">
+          <w:hyperlink w:anchor="_Toc226412973" w:history="1">
             <w:r>
               <w:rPr>
                 <w:rStyle w:val="Hyperlink"/>
@@ -1853,7 +1853,7 @@
                 <w:noProof/>
                 <w:webHidden/>
               </w:rPr>
-              <w:instrText xml:space="preserve"> PAGEREF _Toc226240752 \h </w:instrText>
+              <w:instrText xml:space="preserve"> PAGEREF _Toc226412973 \h </w:instrText>
             </w:r>
             <w:r>
               <w:rPr>
@@ -1899,7 +1899,7 @@
               <w:lang w:eastAsia="fr-FR"/>
             </w:rPr>
           </w:pPr>
-          <w:hyperlink w:anchor="_Toc226240753" w:history="1">
+          <w:hyperlink w:anchor="_Toc226412974" w:history="1">
             <w:r>
               <w:rPr>
                 <w:rStyle w:val="Hyperlink"/>
@@ -1945,7 +1945,7 @@
                 <w:noProof/>
                 <w:webHidden/>
               </w:rPr>
-              <w:instrText xml:space="preserve"> PAGEREF _Toc226240753 \h </w:instrText>
+              <w:instrText xml:space="preserve"> PAGEREF _Toc226412974 \h </w:instrText>
             </w:r>
             <w:r>
               <w:rPr>
@@ -1990,7 +1990,7 @@
               <w:lang w:eastAsia="fr-FR"/>
             </w:rPr>
           </w:pPr>
-          <w:hyperlink w:anchor="_Toc226240754" w:history="1">
+          <w:hyperlink w:anchor="_Toc226412975" w:history="1">
             <w:r>
               <w:rPr>
                 <w:rStyle w:val="Hyperlink"/>
@@ -2020,7 +2020,7 @@
                 <w:noProof/>
                 <w:webHidden/>
               </w:rPr>
-              <w:instrText xml:space="preserve"> PAGEREF _Toc226240754 \h </w:instrText>
+              <w:instrText xml:space="preserve"> PAGEREF _Toc226412975 \h </w:instrText>
             </w:r>
             <w:r>
               <w:rPr>
@@ -2066,7 +2066,7 @@
               <w:lang w:eastAsia="fr-FR"/>
             </w:rPr>
           </w:pPr>
-          <w:hyperlink w:anchor="_Toc226240755" w:history="1">
+          <w:hyperlink w:anchor="_Toc226412976" w:history="1">
             <w:r>
               <w:rPr>
                 <w:rStyle w:val="Hyperlink"/>
@@ -2112,7 +2112,7 @@
                 <w:noProof/>
                 <w:webHidden/>
               </w:rPr>
-              <w:instrText xml:space="preserve"> PAGEREF _Toc226240755 \h </w:instrText>
+              <w:instrText xml:space="preserve"> PAGEREF _Toc226412976 \h </w:instrText>
             </w:r>
             <w:r>
               <w:rPr>
@@ -2158,7 +2158,7 @@
               <w:lang w:eastAsia="fr-FR"/>
             </w:rPr>
           </w:pPr>
-          <w:hyperlink w:anchor="_Toc226240756" w:history="1">
+          <w:hyperlink w:anchor="_Toc226412977" w:history="1">
             <w:r>
               <w:rPr>
                 <w:rStyle w:val="Hyperlink"/>
@@ -2206,7 +2206,7 @@
                 <w:noProof/>
                 <w:webHidden/>
               </w:rPr>
-              <w:instrText xml:space="preserve"> PAGEREF _Toc226240756 \h </w:instrText>
+              <w:instrText xml:space="preserve"> PAGEREF _Toc226412977 \h </w:instrText>
             </w:r>
             <w:r>
               <w:rPr>
@@ -2252,7 +2252,7 @@
               <w:lang w:eastAsia="fr-FR"/>
             </w:rPr>
           </w:pPr>
-          <w:hyperlink w:anchor="_Toc226240757" w:history="1">
+          <w:hyperlink w:anchor="_Toc226412978" w:history="1">
             <w:r>
               <w:rPr>
                 <w:rStyle w:val="Hyperlink"/>
@@ -2298,7 +2298,7 @@
                 <w:noProof/>
                 <w:webHidden/>
               </w:rPr>
-              <w:instrText xml:space="preserve"> PAGEREF _Toc226240757 \h </w:instrText>
+              <w:instrText xml:space="preserve"> PAGEREF _Toc226412978 \h </w:instrText>
             </w:r>
             <w:r>
               <w:rPr>
@@ -2344,7 +2344,7 @@
               <w:lang w:eastAsia="fr-FR"/>
             </w:rPr>
           </w:pPr>
-          <w:hyperlink w:anchor="_Toc226240758" w:history="1">
+          <w:hyperlink w:anchor="_Toc226412979" w:history="1">
             <w:r>
               <w:rPr>
                 <w:rStyle w:val="Hyperlink"/>
@@ -2390,7 +2390,7 @@
                 <w:noProof/>
                 <w:webHidden/>
               </w:rPr>
-              <w:instrText xml:space="preserve"> PAGEREF _Toc226240758 \h </w:instrText>
+              <w:instrText xml:space="preserve"> PAGEREF _Toc226412979 \h </w:instrText>
             </w:r>
             <w:r>
               <w:rPr>
@@ -2435,7 +2435,7 @@
               <w:lang w:eastAsia="fr-FR"/>
             </w:rPr>
           </w:pPr>
-          <w:hyperlink w:anchor="_Toc226240759" w:history="1">
+          <w:hyperlink w:anchor="_Toc226412980" w:history="1">
             <w:r>
               <w:rPr>
                 <w:rStyle w:val="Hyperlink"/>
@@ -2465,7 +2465,7 @@
                 <w:noProof/>
                 <w:webHidden/>
               </w:rPr>
-              <w:instrText xml:space="preserve"> PAGEREF _Toc226240759 \h </w:instrText>
+              <w:instrText xml:space="preserve"> PAGEREF _Toc226412980 \h </w:instrText>
             </w:r>
             <w:r>
               <w:rPr>
@@ -2511,7 +2511,7 @@
               <w:lang w:eastAsia="fr-FR"/>
             </w:rPr>
           </w:pPr>
-          <w:hyperlink w:anchor="_Toc226240760" w:history="1">
+          <w:hyperlink w:anchor="_Toc226412981" w:history="1">
             <w:r>
               <w:rPr>
                 <w:rStyle w:val="Hyperlink"/>
@@ -2557,7 +2557,7 @@
                 <w:noProof/>
                 <w:webHidden/>
               </w:rPr>
-              <w:instrText xml:space="preserve"> PAGEREF _Toc226240760 \h </w:instrText>
+              <w:instrText xml:space="preserve"> PAGEREF _Toc226412981 \h </w:instrText>
             </w:r>
             <w:r>
               <w:rPr>
@@ -2603,7 +2603,7 @@
               <w:lang w:eastAsia="fr-FR"/>
             </w:rPr>
           </w:pPr>
-          <w:hyperlink w:anchor="_Toc226240761" w:history="1">
+          <w:hyperlink w:anchor="_Toc226412982" w:history="1">
             <w:r>
               <w:rPr>
                 <w:rStyle w:val="Hyperlink"/>
@@ -2649,7 +2649,7 @@
                 <w:noProof/>
                 <w:webHidden/>
               </w:rPr>
-              <w:instrText xml:space="preserve"> PAGEREF _Toc226240761 \h </w:instrText>
+              <w:instrText xml:space="preserve"> PAGEREF _Toc226412982 \h </w:instrText>
             </w:r>
             <w:r>
               <w:rPr>
@@ -2695,7 +2695,7 @@
               <w:lang w:eastAsia="fr-FR"/>
             </w:rPr>
           </w:pPr>
-          <w:hyperlink w:anchor="_Toc226240762" w:history="1">
+          <w:hyperlink w:anchor="_Toc226412983" w:history="1">
             <w:r>
               <w:rPr>
                 <w:rStyle w:val="Hyperlink"/>
@@ -2741,7 +2741,7 @@
                 <w:noProof/>
                 <w:webHidden/>
               </w:rPr>
-              <w:instrText xml:space="preserve"> PAGEREF _Toc226240762 \h </w:instrText>
+              <w:instrText xml:space="preserve"> PAGEREF _Toc226412983 \h </w:instrText>
             </w:r>
             <w:r>
               <w:rPr>
@@ -2787,7 +2787,7 @@
               <w:lang w:eastAsia="fr-FR"/>
             </w:rPr>
           </w:pPr>
-          <w:hyperlink w:anchor="_Toc226240763" w:history="1">
+          <w:hyperlink w:anchor="_Toc226412984" w:history="1">
             <w:r>
               <w:rPr>
                 <w:rStyle w:val="Hyperlink"/>
@@ -2833,7 +2833,7 @@
                 <w:noProof/>
                 <w:webHidden/>
               </w:rPr>
-              <w:instrText xml:space="preserve"> PAGEREF _Toc226240763 \h </w:instrText>
+              <w:instrText xml:space="preserve"> PAGEREF _Toc226412984 \h </w:instrText>
             </w:r>
             <w:r>
               <w:rPr>
@@ -2879,7 +2879,7 @@
               <w:lang w:eastAsia="fr-FR"/>
             </w:rPr>
           </w:pPr>
-          <w:hyperlink w:anchor="_Toc226240764" w:history="1">
+          <w:hyperlink w:anchor="_Toc226412985" w:history="1">
             <w:r>
               <w:rPr>
                 <w:rStyle w:val="Hyperlink"/>
@@ -2927,7 +2927,7 @@
                 <w:noProof/>
                 <w:webHidden/>
               </w:rPr>
-              <w:instrText xml:space="preserve"> PAGEREF _Toc226240764 \h </w:instrText>
+              <w:instrText xml:space="preserve"> PAGEREF _Toc226412985 \h </w:instrText>
             </w:r>
             <w:r>
               <w:rPr>
@@ -2947,7 +2947,7 @@
                 <w:noProof/>
                 <w:webHidden/>
               </w:rPr>
-              <w:t>23</w:t>
+              <w:t>24</w:t>
             </w:r>
             <w:r>
               <w:rPr>
@@ -2973,7 +2973,7 @@
               <w:lang w:eastAsia="fr-FR"/>
             </w:rPr>
           </w:pPr>
-          <w:hyperlink w:anchor="_Toc226240765" w:history="1">
+          <w:hyperlink w:anchor="_Toc226412986" w:history="1">
             <w:r>
               <w:rPr>
                 <w:rStyle w:val="Hyperlink"/>
@@ -3019,7 +3019,7 @@
                 <w:noProof/>
                 <w:webHidden/>
               </w:rPr>
-              <w:instrText xml:space="preserve"> PAGEREF _Toc226240765 \h </w:instrText>
+              <w:instrText xml:space="preserve"> PAGEREF _Toc226412986 \h </w:instrText>
             </w:r>
             <w:r>
               <w:rPr>
@@ -3039,7 +3039,7 @@
                 <w:noProof/>
                 <w:webHidden/>
               </w:rPr>
-              <w:t>24</w:t>
+              <w:t>25</w:t>
             </w:r>
             <w:r>
               <w:rPr>
@@ -3065,7 +3065,7 @@
               <w:lang w:eastAsia="fr-FR"/>
             </w:rPr>
           </w:pPr>
-          <w:hyperlink w:anchor="_Toc226240766" w:history="1">
+          <w:hyperlink w:anchor="_Toc226412987" w:history="1">
             <w:r>
               <w:rPr>
                 <w:rStyle w:val="Hyperlink"/>
@@ -3111,7 +3111,7 @@
                 <w:noProof/>
                 <w:webHidden/>
               </w:rPr>
-              <w:instrText xml:space="preserve"> PAGEREF _Toc226240766 \h </w:instrText>
+              <w:instrText xml:space="preserve"> PAGEREF _Toc226412987 \h </w:instrText>
             </w:r>
             <w:r>
               <w:rPr>
@@ -3131,7 +3131,7 @@
                 <w:noProof/>
                 <w:webHidden/>
               </w:rPr>
-              <w:t>25</w:t>
+              <w:t>26</w:t>
             </w:r>
             <w:r>
               <w:rPr>
@@ -3157,7 +3157,7 @@
               <w:lang w:eastAsia="fr-FR"/>
             </w:rPr>
           </w:pPr>
-          <w:hyperlink w:anchor="_Toc226240767" w:history="1">
+          <w:hyperlink w:anchor="_Toc226412988" w:history="1">
             <w:r>
               <w:rPr>
                 <w:rStyle w:val="Hyperlink"/>
@@ -3203,7 +3203,7 @@
                 <w:noProof/>
                 <w:webHidden/>
               </w:rPr>
-              <w:instrText xml:space="preserve"> PAGEREF _Toc226240767 \h </w:instrText>
+              <w:instrText xml:space="preserve"> PAGEREF _Toc226412988 \h </w:instrText>
             </w:r>
             <w:r>
               <w:rPr>
@@ -3223,7 +3223,7 @@
                 <w:noProof/>
                 <w:webHidden/>
               </w:rPr>
-              <w:t>25</w:t>
+              <w:t>26</w:t>
             </w:r>
             <w:r>
               <w:rPr>
@@ -3249,7 +3249,7 @@
               <w:lang w:eastAsia="fr-FR"/>
             </w:rPr>
           </w:pPr>
-          <w:hyperlink w:anchor="_Toc226240768" w:history="1">
+          <w:hyperlink w:anchor="_Toc226412989" w:history="1">
             <w:r>
               <w:rPr>
                 <w:rStyle w:val="Hyperlink"/>
@@ -3295,7 +3295,7 @@
                 <w:noProof/>
                 <w:webHidden/>
               </w:rPr>
-              <w:instrText xml:space="preserve"> PAGEREF _Toc226240768 \h </w:instrText>
+              <w:instrText xml:space="preserve"> PAGEREF _Toc226412989 \h </w:instrText>
             </w:r>
             <w:r>
               <w:rPr>
@@ -3315,7 +3315,7 @@
                 <w:noProof/>
                 <w:webHidden/>
               </w:rPr>
-              <w:t>26</w:t>
+              <w:t>27</w:t>
             </w:r>
             <w:r>
               <w:rPr>
@@ -3341,7 +3341,7 @@
               <w:lang w:eastAsia="fr-FR"/>
             </w:rPr>
           </w:pPr>
-          <w:hyperlink w:anchor="_Toc226240769" w:history="1">
+          <w:hyperlink w:anchor="_Toc226412990" w:history="1">
             <w:r>
               <w:rPr>
                 <w:rStyle w:val="Hyperlink"/>
@@ -3387,7 +3387,7 @@
                 <w:noProof/>
                 <w:webHidden/>
               </w:rPr>
-              <w:instrText xml:space="preserve"> PAGEREF _Toc226240769 \h </w:instrText>
+              <w:instrText xml:space="preserve"> PAGEREF _Toc226412990 \h </w:instrText>
             </w:r>
             <w:r>
               <w:rPr>
@@ -3407,7 +3407,7 @@
                 <w:noProof/>
                 <w:webHidden/>
               </w:rPr>
-              <w:t>27</w:t>
+              <w:t>28</w:t>
             </w:r>
             <w:r>
               <w:rPr>
@@ -3432,7 +3432,7 @@
               <w:lang w:eastAsia="fr-FR"/>
             </w:rPr>
           </w:pPr>
-          <w:hyperlink w:anchor="_Toc226240770" w:history="1">
+          <w:hyperlink w:anchor="_Toc226412991" w:history="1">
             <w:r>
               <w:rPr>
                 <w:rStyle w:val="Hyperlink"/>
@@ -3462,7 +3462,7 @@
                 <w:noProof/>
                 <w:webHidden/>
               </w:rPr>
-              <w:instrText xml:space="preserve"> PAGEREF _Toc226240770 \h </w:instrText>
+              <w:instrText xml:space="preserve"> PAGEREF _Toc226412991 \h </w:instrText>
             </w:r>
             <w:r>
               <w:rPr>
@@ -3482,7 +3482,7 @@
                 <w:noProof/>
                 <w:webHidden/>
               </w:rPr>
-              <w:t>30</w:t>
+              <w:t>31</w:t>
             </w:r>
             <w:r>
               <w:rPr>
@@ -3508,7 +3508,7 @@
               <w:lang w:eastAsia="fr-FR"/>
             </w:rPr>
           </w:pPr>
-          <w:hyperlink w:anchor="_Toc226240771" w:history="1">
+          <w:hyperlink w:anchor="_Toc226412992" w:history="1">
             <w:r>
               <w:rPr>
                 <w:rStyle w:val="Hyperlink"/>
@@ -3554,7 +3554,7 @@
                 <w:noProof/>
                 <w:webHidden/>
               </w:rPr>
-              <w:instrText xml:space="preserve"> PAGEREF _Toc226240771 \h </w:instrText>
+              <w:instrText xml:space="preserve"> PAGEREF _Toc226412992 \h </w:instrText>
             </w:r>
             <w:r>
               <w:rPr>
@@ -3574,7 +3574,7 @@
                 <w:noProof/>
                 <w:webHidden/>
               </w:rPr>
-              <w:t>30</w:t>
+              <w:t>31</w:t>
             </w:r>
             <w:r>
               <w:rPr>
@@ -3600,7 +3600,7 @@
               <w:lang w:eastAsia="fr-FR"/>
             </w:rPr>
           </w:pPr>
-          <w:hyperlink w:anchor="_Toc226240772" w:history="1">
+          <w:hyperlink w:anchor="_Toc226412993" w:history="1">
             <w:r>
               <w:rPr>
                 <w:rStyle w:val="Hyperlink"/>
@@ -3646,7 +3646,7 @@
                 <w:noProof/>
                 <w:webHidden/>
               </w:rPr>
-              <w:instrText xml:space="preserve"> PAGEREF _Toc226240772 \h </w:instrText>
+              <w:instrText xml:space="preserve"> PAGEREF _Toc226412993 \h </w:instrText>
             </w:r>
             <w:r>
               <w:rPr>
@@ -3666,7 +3666,7 @@
                 <w:noProof/>
                 <w:webHidden/>
               </w:rPr>
-              <w:t>30</w:t>
+              <w:t>31</w:t>
             </w:r>
             <w:r>
               <w:rPr>
@@ -3692,7 +3692,7 @@
               <w:lang w:eastAsia="fr-FR"/>
             </w:rPr>
           </w:pPr>
-          <w:hyperlink w:anchor="_Toc226240773" w:history="1">
+          <w:hyperlink w:anchor="_Toc226412994" w:history="1">
             <w:r>
               <w:rPr>
                 <w:rStyle w:val="Hyperlink"/>
@@ -3739,7 +3739,7 @@
                 <w:noProof/>
                 <w:webHidden/>
               </w:rPr>
-              <w:instrText xml:space="preserve"> PAGEREF _Toc226240773 \h </w:instrText>
+              <w:instrText xml:space="preserve"> PAGEREF _Toc226412994 \h </w:instrText>
             </w:r>
             <w:r>
               <w:rPr>
@@ -3759,7 +3759,7 @@
                 <w:noProof/>
                 <w:webHidden/>
               </w:rPr>
-              <w:t>30</w:t>
+              <w:t>31</w:t>
             </w:r>
             <w:r>
               <w:rPr>
@@ -3785,7 +3785,7 @@
               <w:lang w:eastAsia="fr-FR"/>
             </w:rPr>
           </w:pPr>
-          <w:hyperlink w:anchor="_Toc226240774" w:history="1">
+          <w:hyperlink w:anchor="_Toc226412995" w:history="1">
             <w:r>
               <w:rPr>
                 <w:rStyle w:val="Hyperlink"/>
@@ -3831,7 +3831,7 @@
                 <w:noProof/>
                 <w:webHidden/>
               </w:rPr>
-              <w:instrText xml:space="preserve"> PAGEREF _Toc226240774 \h </w:instrText>
+              <w:instrText xml:space="preserve"> PAGEREF _Toc226412995 \h </w:instrText>
             </w:r>
             <w:r>
               <w:rPr>
@@ -3851,7 +3851,7 @@
                 <w:noProof/>
                 <w:webHidden/>
               </w:rPr>
-              <w:t>31</w:t>
+              <w:t>32</w:t>
             </w:r>
             <w:r>
               <w:rPr>
@@ -3877,7 +3877,7 @@
               <w:lang w:eastAsia="fr-FR"/>
             </w:rPr>
           </w:pPr>
-          <w:hyperlink w:anchor="_Toc226240775" w:history="1">
+          <w:hyperlink w:anchor="_Toc226412996" w:history="1">
             <w:r>
               <w:rPr>
                 <w:rStyle w:val="Hyperlink"/>
@@ -3923,7 +3923,7 @@
                 <w:noProof/>
                 <w:webHidden/>
               </w:rPr>
-              <w:instrText xml:space="preserve"> PAGEREF _Toc226240775 \h </w:instrText>
+              <w:instrText xml:space="preserve"> PAGEREF _Toc226412996 \h </w:instrText>
             </w:r>
             <w:r>
               <w:rPr>
@@ -3943,7 +3943,7 @@
                 <w:noProof/>
                 <w:webHidden/>
               </w:rPr>
-              <w:t>31</w:t>
+              <w:t>32</w:t>
             </w:r>
             <w:r>
               <w:rPr>
@@ -3969,7 +3969,7 @@
               <w:lang w:eastAsia="fr-FR"/>
             </w:rPr>
           </w:pPr>
-          <w:hyperlink w:anchor="_Toc226240776" w:history="1">
+          <w:hyperlink w:anchor="_Toc226412997" w:history="1">
             <w:r>
               <w:rPr>
                 <w:rStyle w:val="Hyperlink"/>
@@ -4015,7 +4015,7 @@
                 <w:noProof/>
                 <w:webHidden/>
               </w:rPr>
-              <w:instrText xml:space="preserve"> PAGEREF _Toc226240776 \h </w:instrText>
+              <w:instrText xml:space="preserve"> PAGEREF _Toc226412997 \h </w:instrText>
             </w:r>
             <w:r>
               <w:rPr>
@@ -4035,7 +4035,7 @@
                 <w:noProof/>
                 <w:webHidden/>
               </w:rPr>
-              <w:t>31</w:t>
+              <w:t>32</w:t>
             </w:r>
             <w:r>
               <w:rPr>
@@ -4061,7 +4061,7 @@
               <w:lang w:eastAsia="fr-FR"/>
             </w:rPr>
           </w:pPr>
-          <w:hyperlink w:anchor="_Toc226240777" w:history="1">
+          <w:hyperlink w:anchor="_Toc226412998" w:history="1">
             <w:r>
               <w:rPr>
                 <w:rStyle w:val="Hyperlink"/>
@@ -4107,7 +4107,7 @@
                 <w:noProof/>
                 <w:webHidden/>
               </w:rPr>
-              <w:instrText xml:space="preserve"> PAGEREF _Toc226240777 \h </w:instrText>
+              <w:instrText xml:space="preserve"> PAGEREF _Toc226412998 \h </w:instrText>
             </w:r>
             <w:r>
               <w:rPr>
@@ -4127,7 +4127,7 @@
                 <w:noProof/>
                 <w:webHidden/>
               </w:rPr>
-              <w:t>32</w:t>
+              <w:t>33</w:t>
             </w:r>
             <w:r>
               <w:rPr>
@@ -4153,7 +4153,7 @@
               <w:lang w:eastAsia="fr-FR"/>
             </w:rPr>
           </w:pPr>
-          <w:hyperlink w:anchor="_Toc226240778" w:history="1">
+          <w:hyperlink w:anchor="_Toc226412999" w:history="1">
             <w:r>
               <w:rPr>
                 <w:rStyle w:val="Hyperlink"/>
@@ -4199,7 +4199,7 @@
                 <w:noProof/>
                 <w:webHidden/>
               </w:rPr>
-              <w:instrText xml:space="preserve"> PAGEREF _Toc226240778 \h </w:instrText>
+              <w:instrText xml:space="preserve"> PAGEREF _Toc226412999 \h </w:instrText>
             </w:r>
             <w:r>
               <w:rPr>
@@ -4219,7 +4219,7 @@
                 <w:noProof/>
                 <w:webHidden/>
               </w:rPr>
-              <w:t>32</w:t>
+              <w:t>33</w:t>
             </w:r>
             <w:r>
               <w:rPr>
@@ -4245,7 +4245,7 @@
               <w:lang w:eastAsia="fr-FR"/>
             </w:rPr>
           </w:pPr>
-          <w:hyperlink w:anchor="_Toc226240779" w:history="1">
+          <w:hyperlink w:anchor="_Toc226413000" w:history="1">
             <w:r>
               <w:rPr>
                 <w:rStyle w:val="Hyperlink"/>
@@ -4301,7 +4301,7 @@
                 <w:noProof/>
                 <w:webHidden/>
               </w:rPr>
-              <w:instrText xml:space="preserve"> PAGEREF _Toc226240779 \h </w:instrText>
+              <w:instrText xml:space="preserve"> PAGEREF _Toc226413000 \h </w:instrText>
             </w:r>
             <w:r>
               <w:rPr>
@@ -4321,7 +4321,7 @@
                 <w:noProof/>
                 <w:webHidden/>
               </w:rPr>
-              <w:t>32</w:t>
+              <w:t>33</w:t>
             </w:r>
             <w:r>
               <w:rPr>
@@ -4347,7 +4347,7 @@
               <w:lang w:eastAsia="fr-FR"/>
             </w:rPr>
           </w:pPr>
-          <w:hyperlink w:anchor="_Toc226240780" w:history="1">
+          <w:hyperlink w:anchor="_Toc226413001" w:history="1">
             <w:r>
               <w:rPr>
                 <w:rStyle w:val="Hyperlink"/>
@@ -4399,7 +4399,7 @@
                 <w:noProof/>
                 <w:webHidden/>
               </w:rPr>
-              <w:instrText xml:space="preserve"> PAGEREF _Toc226240780 \h </w:instrText>
+              <w:instrText xml:space="preserve"> PAGEREF _Toc226413001 \h </w:instrText>
             </w:r>
             <w:r>
               <w:rPr>
@@ -4419,7 +4419,7 @@
                 <w:noProof/>
                 <w:webHidden/>
               </w:rPr>
-              <w:t>33</w:t>
+              <w:t>34</w:t>
             </w:r>
             <w:r>
               <w:rPr>
@@ -4445,7 +4445,7 @@
               <w:lang w:eastAsia="fr-FR"/>
             </w:rPr>
           </w:pPr>
-          <w:hyperlink w:anchor="_Toc226240781" w:history="1">
+          <w:hyperlink w:anchor="_Toc226413002" w:history="1">
             <w:r>
               <w:rPr>
                 <w:rStyle w:val="Hyperlink"/>
@@ -4490,7 +4490,7 @@
                 <w:noProof/>
                 <w:webHidden/>
               </w:rPr>
-              <w:instrText xml:space="preserve"> PAGEREF _Toc226240781 \h </w:instrText>
+              <w:instrText xml:space="preserve"> PAGEREF _Toc226413002 \h </w:instrText>
             </w:r>
             <w:r>
               <w:rPr>
@@ -4510,7 +4510,7 @@
                 <w:noProof/>
                 <w:webHidden/>
               </w:rPr>
-              <w:t>33</w:t>
+              <w:t>34</w:t>
             </w:r>
             <w:r>
               <w:rPr>
@@ -4536,7 +4536,7 @@
               <w:lang w:eastAsia="fr-FR"/>
             </w:rPr>
           </w:pPr>
-          <w:hyperlink w:anchor="_Toc226240782" w:history="1">
+          <w:hyperlink w:anchor="_Toc226413003" w:history="1">
             <w:r>
               <w:rPr>
                 <w:rStyle w:val="Hyperlink"/>
@@ -4582,7 +4582,7 @@
                 <w:noProof/>
                 <w:webHidden/>
               </w:rPr>
-              <w:instrText xml:space="preserve"> PAGEREF _Toc226240782 \h </w:instrText>
+              <w:instrText xml:space="preserve"> PAGEREF _Toc226413003 \h </w:instrText>
             </w:r>
             <w:r>
               <w:rPr>
@@ -4602,7 +4602,7 @@
                 <w:noProof/>
                 <w:webHidden/>
               </w:rPr>
-              <w:t>33</w:t>
+              <w:t>34</w:t>
             </w:r>
             <w:r>
               <w:rPr>
@@ -4628,7 +4628,7 @@
               <w:lang w:eastAsia="fr-FR"/>
             </w:rPr>
           </w:pPr>
-          <w:hyperlink w:anchor="_Toc226240783" w:history="1">
+          <w:hyperlink w:anchor="_Toc226413004" w:history="1">
             <w:r>
               <w:rPr>
                 <w:rStyle w:val="Hyperlink"/>
@@ -4672,7 +4672,7 @@
                 <w:noProof/>
                 <w:webHidden/>
               </w:rPr>
-              <w:instrText xml:space="preserve"> PAGEREF _Toc226240783 \h </w:instrText>
+              <w:instrText xml:space="preserve"> PAGEREF _Toc226413004 \h </w:instrText>
             </w:r>
             <w:r>
               <w:rPr>
@@ -4692,7 +4692,7 @@
                 <w:noProof/>
                 <w:webHidden/>
               </w:rPr>
-              <w:t>34</w:t>
+              <w:t>35</w:t>
             </w:r>
             <w:r>
               <w:rPr>
@@ -4718,7 +4718,7 @@
               <w:lang w:eastAsia="fr-FR"/>
             </w:rPr>
           </w:pPr>
-          <w:hyperlink w:anchor="_Toc226240784" w:history="1">
+          <w:hyperlink w:anchor="_Toc226413005" w:history="1">
             <w:r>
               <w:rPr>
                 <w:rStyle w:val="Hyperlink"/>
@@ -4762,7 +4762,7 @@
                 <w:noProof/>
                 <w:webHidden/>
               </w:rPr>
-              <w:instrText xml:space="preserve"> PAGEREF _Toc226240784 \h </w:instrText>
+              <w:instrText xml:space="preserve"> PAGEREF _Toc226413005 \h </w:instrText>
             </w:r>
             <w:r>
               <w:rPr>
@@ -4782,7 +4782,7 @@
                 <w:noProof/>
                 <w:webHidden/>
               </w:rPr>
-              <w:t>34</w:t>
+              <w:t>35</w:t>
             </w:r>
             <w:r>
               <w:rPr>
@@ -4808,7 +4808,7 @@
               <w:lang w:eastAsia="fr-FR"/>
             </w:rPr>
           </w:pPr>
-          <w:hyperlink w:anchor="_Toc226240785" w:history="1">
+          <w:hyperlink w:anchor="_Toc226413006" w:history="1">
             <w:r>
               <w:rPr>
                 <w:rStyle w:val="Hyperlink"/>
@@ -4852,7 +4852,7 @@
                 <w:noProof/>
                 <w:webHidden/>
               </w:rPr>
-              <w:instrText xml:space="preserve"> PAGEREF _Toc226240785 \h </w:instrText>
+              <w:instrText xml:space="preserve"> PAGEREF _Toc226413006 \h </w:instrText>
             </w:r>
             <w:r>
               <w:rPr>
@@ -4872,7 +4872,7 @@
                 <w:noProof/>
                 <w:webHidden/>
               </w:rPr>
-              <w:t>36</w:t>
+              <w:t>37</w:t>
             </w:r>
             <w:r>
               <w:rPr>
@@ -4897,11 +4897,13 @@
               <w:lang w:eastAsia="fr-FR"/>
             </w:rPr>
           </w:pPr>
-          <w:hyperlink w:anchor="_Toc226240786" w:history="1">
+          <w:hyperlink w:anchor="_Toc226413007" w:history="1">
             <w:r>
               <w:rPr>
                 <w:rStyle w:val="Hyperlink"/>
                 <w:rFonts w:ascii="Times New Roman" w:hAnsi="Times New Roman" w:cs="Times New Roman"/>
+                <w:b/>
+                <w:bCs/>
                 <w:noProof/>
               </w:rPr>
               <w:t>Conclusion</w:t>
@@ -4925,7 +4927,7 @@
                 <w:noProof/>
                 <w:webHidden/>
               </w:rPr>
-              <w:instrText xml:space="preserve"> PAGEREF _Toc226240786 \h </w:instrText>
+              <w:instrText xml:space="preserve"> PAGEREF _Toc226413007 \h </w:instrText>
             </w:r>
             <w:r>
               <w:rPr>
@@ -4945,7 +4947,7 @@
                 <w:noProof/>
                 <w:webHidden/>
               </w:rPr>
-              <w:t>40</w:t>
+              <w:t>41</w:t>
             </w:r>
             <w:r>
               <w:rPr>
@@ -4970,11 +4972,13 @@
               <w:lang w:eastAsia="fr-FR"/>
             </w:rPr>
           </w:pPr>
-          <w:hyperlink w:anchor="_Toc226240787" w:history="1">
+          <w:hyperlink w:anchor="_Toc226413008" w:history="1">
             <w:r>
               <w:rPr>
                 <w:rStyle w:val="Hyperlink"/>
                 <w:rFonts w:asciiTheme="majorBidi" w:hAnsiTheme="majorBidi"/>
+                <w:b/>
+                <w:bCs/>
                 <w:noProof/>
                 <w:lang w:val="en-US"/>
               </w:rPr>
@@ -4999,7 +5003,7 @@
                 <w:noProof/>
                 <w:webHidden/>
               </w:rPr>
-              <w:instrText xml:space="preserve"> PAGEREF _Toc226240787 \h </w:instrText>
+              <w:instrText xml:space="preserve"> PAGEREF _Toc226413008 \h </w:instrText>
             </w:r>
             <w:r>
               <w:rPr>
@@ -5019,7 +5023,7 @@
                 <w:noProof/>
                 <w:webHidden/>
               </w:rPr>
-              <w:t>41</w:t>
+              <w:t>42</w:t>
             </w:r>
             <w:r>
               <w:rPr>
@@ -5185,7 +5189,7 @@
           <w:u w:val="single"/>
         </w:rPr>
       </w:pPr>
-      <w:bookmarkStart w:id="1" w:name="_Toc226240744"/>
+      <w:bookmarkStart w:id="1" w:name="_Toc226412965"/>
       <w:r>
         <w:rPr>
           <w:rFonts w:ascii="Times New Roman" w:hAnsi="Times New Roman" w:cs="Times New Roman"/>
@@ -5223,7 +5227,7 @@
       <w:r>
         <w:fldChar w:fldCharType="separate"/>
       </w:r>
-      <w:hyperlink w:anchor="_Toc226240788" w:history="1">
+      <w:hyperlink w:anchor="_Toc226412934" w:history="1">
         <w:r>
           <w:rPr>
             <w:rStyle w:val="Hyperlink"/>
@@ -5251,7 +5255,7 @@
             <w:noProof/>
             <w:webHidden/>
           </w:rPr>
-          <w:instrText xml:space="preserve"> PAGEREF _Toc226240788 \h </w:instrText>
+          <w:instrText xml:space="preserve"> PAGEREF _Toc226412934 \h </w:instrText>
         </w:r>
         <w:r>
           <w:rPr>
@@ -5296,7 +5300,7 @@
           <w:lang w:eastAsia="fr-FR"/>
         </w:rPr>
       </w:pPr>
-      <w:hyperlink w:anchor="_Toc226240789" w:history="1">
+      <w:hyperlink w:anchor="_Toc226412935" w:history="1">
         <w:r>
           <w:rPr>
             <w:rStyle w:val="Hyperlink"/>
@@ -5324,7 +5328,7 @@
             <w:noProof/>
             <w:webHidden/>
           </w:rPr>
-          <w:instrText xml:space="preserve"> PAGEREF _Toc226240789 \h </w:instrText>
+          <w:instrText xml:space="preserve"> PAGEREF _Toc226412935 \h </w:instrText>
         </w:r>
         <w:r>
           <w:rPr>
@@ -5369,7 +5373,7 @@
           <w:lang w:eastAsia="fr-FR"/>
         </w:rPr>
       </w:pPr>
-      <w:hyperlink w:anchor="_Toc226240790" w:history="1">
+      <w:hyperlink w:anchor="_Toc226412936" w:history="1">
         <w:r>
           <w:rPr>
             <w:rStyle w:val="Hyperlink"/>
@@ -5397,7 +5401,7 @@
             <w:noProof/>
             <w:webHidden/>
           </w:rPr>
-          <w:instrText xml:space="preserve"> PAGEREF _Toc226240790 \h </w:instrText>
+          <w:instrText xml:space="preserve"> PAGEREF _Toc226412936 \h </w:instrText>
         </w:r>
         <w:r>
           <w:rPr>
@@ -5442,14 +5446,13 @@
           <w:lang w:eastAsia="fr-FR"/>
         </w:rPr>
       </w:pPr>
-      <w:hyperlink w:anchor="_Toc226240791" w:history="1">
+      <w:hyperlink w:anchor="_Toc226412937" w:history="1">
         <w:r>
           <w:rPr>
             <w:rStyle w:val="Hyperlink"/>
-            <w:rFonts w:asciiTheme="majorBidi" w:hAnsiTheme="majorBidi" w:cstheme="majorBidi"/>
             <w:noProof/>
           </w:rPr>
-          <w:t>Figure 4: Logo de Flask</w:t>
+          <w:t>Figure 4: Logo html</w:t>
         </w:r>
         <w:r>
           <w:rPr>
@@ -5470,7 +5473,7 @@
             <w:noProof/>
             <w:webHidden/>
           </w:rPr>
-          <w:instrText xml:space="preserve"> PAGEREF _Toc226240791 \h </w:instrText>
+          <w:instrText xml:space="preserve"> PAGEREF _Toc226412937 \h </w:instrText>
         </w:r>
         <w:r>
           <w:rPr>
@@ -5515,14 +5518,13 @@
           <w:lang w:eastAsia="fr-FR"/>
         </w:rPr>
       </w:pPr>
-      <w:hyperlink w:anchor="_Toc226240792" w:history="1">
+      <w:hyperlink w:anchor="_Toc226412938" w:history="1">
         <w:r>
           <w:rPr>
             <w:rStyle w:val="Hyperlink"/>
-            <w:rFonts w:asciiTheme="majorBidi" w:hAnsiTheme="majorBidi" w:cstheme="majorBidi"/>
             <w:noProof/>
           </w:rPr>
-          <w:t>Figure 5: Logo de PostgreSQL</w:t>
+          <w:t>Figure 5: logo Typescript</w:t>
         </w:r>
         <w:r>
           <w:rPr>
@@ -5543,80 +5545,7 @@
             <w:noProof/>
             <w:webHidden/>
           </w:rPr>
-          <w:instrText xml:space="preserve"> PAGEREF _Toc226240792 \h </w:instrText>
-        </w:r>
-        <w:r>
-          <w:rPr>
-            <w:noProof/>
-            <w:webHidden/>
-          </w:rPr>
-        </w:r>
-        <w:r>
-          <w:rPr>
-            <w:noProof/>
-            <w:webHidden/>
-          </w:rPr>
-          <w:fldChar w:fldCharType="separate"/>
-        </w:r>
-        <w:r>
-          <w:rPr>
-            <w:noProof/>
-            <w:webHidden/>
-          </w:rPr>
-          <w:t>20</w:t>
-        </w:r>
-        <w:r>
-          <w:rPr>
-            <w:noProof/>
-            <w:webHidden/>
-          </w:rPr>
-          <w:fldChar w:fldCharType="end"/>
-        </w:r>
-      </w:hyperlink>
-    </w:p>
-    <w:p>
-      <w:pPr>
-        <w:pStyle w:val="TableofFigures"/>
-        <w:tabs>
-          <w:tab w:val="right" w:leader="dot" w:pos="9062"/>
-        </w:tabs>
-        <w:rPr>
-          <w:rFonts w:eastAsiaTheme="minorEastAsia"/>
-          <w:noProof/>
-          <w:sz w:val="24"/>
-          <w:szCs w:val="24"/>
-          <w:lang w:eastAsia="fr-FR"/>
-        </w:rPr>
-      </w:pPr>
-      <w:hyperlink w:anchor="_Toc226240793" w:history="1">
-        <w:r>
-          <w:rPr>
-            <w:rStyle w:val="Hyperlink"/>
-            <w:rFonts w:asciiTheme="majorBidi" w:hAnsiTheme="majorBidi" w:cstheme="majorBidi"/>
-            <w:noProof/>
-          </w:rPr>
-          <w:t>Figure 6: Logo de Figma</w:t>
-        </w:r>
-        <w:r>
-          <w:rPr>
-            <w:noProof/>
-            <w:webHidden/>
-          </w:rPr>
-          <w:tab/>
-        </w:r>
-        <w:r>
-          <w:rPr>
-            <w:noProof/>
-            <w:webHidden/>
-          </w:rPr>
-          <w:fldChar w:fldCharType="begin"/>
-        </w:r>
-        <w:r>
-          <w:rPr>
-            <w:noProof/>
-            <w:webHidden/>
-          </w:rPr>
-          <w:instrText xml:space="preserve"> PAGEREF _Toc226240793 \h </w:instrText>
+          <w:instrText xml:space="preserve"> PAGEREF _Toc226412938 \h </w:instrText>
         </w:r>
         <w:r>
           <w:rPr>
@@ -5661,14 +5590,14 @@
           <w:lang w:eastAsia="fr-FR"/>
         </w:rPr>
       </w:pPr>
-      <w:hyperlink w:anchor="_Toc226240794" w:history="1">
+      <w:hyperlink w:anchor="_Toc226412939" w:history="1">
         <w:r>
           <w:rPr>
             <w:rStyle w:val="Hyperlink"/>
             <w:rFonts w:asciiTheme="majorBidi" w:hAnsiTheme="majorBidi" w:cstheme="majorBidi"/>
             <w:noProof/>
           </w:rPr>
-          <w:t>Figure 7: Logo de Photoshop</w:t>
+          <w:t>Figure 6: Logo de Flask</w:t>
         </w:r>
         <w:r>
           <w:rPr>
@@ -5689,7 +5618,7 @@
             <w:noProof/>
             <w:webHidden/>
           </w:rPr>
-          <w:instrText xml:space="preserve"> PAGEREF _Toc226240794 \h </w:instrText>
+          <w:instrText xml:space="preserve"> PAGEREF _Toc226412939 \h </w:instrText>
         </w:r>
         <w:r>
           <w:rPr>
@@ -5734,14 +5663,14 @@
           <w:lang w:eastAsia="fr-FR"/>
         </w:rPr>
       </w:pPr>
-      <w:hyperlink w:anchor="_Toc226240795" w:history="1">
+      <w:hyperlink w:anchor="_Toc226412940" w:history="1">
         <w:r>
           <w:rPr>
             <w:rStyle w:val="Hyperlink"/>
             <w:rFonts w:asciiTheme="majorBidi" w:hAnsiTheme="majorBidi" w:cstheme="majorBidi"/>
             <w:noProof/>
           </w:rPr>
-          <w:t>Figure 8: Logo de illustrator</w:t>
+          <w:t>Figure 7: Logo de PostgreSQL</w:t>
         </w:r>
         <w:r>
           <w:rPr>
@@ -5762,7 +5691,7 @@
             <w:noProof/>
             <w:webHidden/>
           </w:rPr>
-          <w:instrText xml:space="preserve"> PAGEREF _Toc226240795 \h </w:instrText>
+          <w:instrText xml:space="preserve"> PAGEREF _Toc226412940 \h </w:instrText>
         </w:r>
         <w:r>
           <w:rPr>
@@ -5807,14 +5736,14 @@
           <w:lang w:eastAsia="fr-FR"/>
         </w:rPr>
       </w:pPr>
-      <w:hyperlink w:anchor="_Toc226240796" w:history="1">
+      <w:hyperlink w:anchor="_Toc226412941" w:history="1">
         <w:r>
           <w:rPr>
             <w:rStyle w:val="Hyperlink"/>
             <w:rFonts w:asciiTheme="majorBidi" w:hAnsiTheme="majorBidi" w:cstheme="majorBidi"/>
             <w:noProof/>
           </w:rPr>
-          <w:t>Figure 9: Logo  du site web</w:t>
+          <w:t>Figure 8: Logo de Figma</w:t>
         </w:r>
         <w:r>
           <w:rPr>
@@ -5835,7 +5764,7 @@
             <w:noProof/>
             <w:webHidden/>
           </w:rPr>
-          <w:instrText xml:space="preserve"> PAGEREF _Toc226240796 \h </w:instrText>
+          <w:instrText xml:space="preserve"> PAGEREF _Toc226412941 \h </w:instrText>
         </w:r>
         <w:r>
           <w:rPr>
@@ -5880,13 +5809,14 @@
           <w:lang w:eastAsia="fr-FR"/>
         </w:rPr>
       </w:pPr>
-      <w:hyperlink w:anchor="_Toc226240797" w:history="1">
+      <w:hyperlink w:anchor="_Toc226412942" w:history="1">
         <w:r>
           <w:rPr>
             <w:rStyle w:val="Hyperlink"/>
+            <w:rFonts w:asciiTheme="majorBidi" w:hAnsiTheme="majorBidi" w:cstheme="majorBidi"/>
             <w:noProof/>
           </w:rPr>
-          <w:t>Figure 10: La typographie</w:t>
+          <w:t>Figure 9: Logo de Photoshop</w:t>
         </w:r>
         <w:r>
           <w:rPr>
@@ -5907,7 +5837,7 @@
             <w:noProof/>
             <w:webHidden/>
           </w:rPr>
-          <w:instrText xml:space="preserve"> PAGEREF _Toc226240797 \h </w:instrText>
+          <w:instrText xml:space="preserve"> PAGEREF _Toc226412942 \h </w:instrText>
         </w:r>
         <w:r>
           <w:rPr>
@@ -5952,13 +5882,14 @@
           <w:lang w:eastAsia="fr-FR"/>
         </w:rPr>
       </w:pPr>
-      <w:hyperlink w:anchor="_Toc226240798" w:history="1">
+      <w:hyperlink w:anchor="_Toc226412943" w:history="1">
         <w:r>
           <w:rPr>
             <w:rStyle w:val="Hyperlink"/>
+            <w:rFonts w:asciiTheme="majorBidi" w:hAnsiTheme="majorBidi" w:cstheme="majorBidi"/>
             <w:noProof/>
           </w:rPr>
-          <w:t>Figure 11: la palette de couleurs</w:t>
+          <w:t>Figure 10: Logo de illustrator</w:t>
         </w:r>
         <w:r>
           <w:rPr>
@@ -5979,7 +5910,80 @@
             <w:noProof/>
             <w:webHidden/>
           </w:rPr>
-          <w:instrText xml:space="preserve"> PAGEREF _Toc226240798 \h </w:instrText>
+          <w:instrText xml:space="preserve"> PAGEREF _Toc226412943 \h </w:instrText>
+        </w:r>
+        <w:r>
+          <w:rPr>
+            <w:noProof/>
+            <w:webHidden/>
+          </w:rPr>
+        </w:r>
+        <w:r>
+          <w:rPr>
+            <w:noProof/>
+            <w:webHidden/>
+          </w:rPr>
+          <w:fldChar w:fldCharType="separate"/>
+        </w:r>
+        <w:r>
+          <w:rPr>
+            <w:noProof/>
+            <w:webHidden/>
+          </w:rPr>
+          <w:t>22</w:t>
+        </w:r>
+        <w:r>
+          <w:rPr>
+            <w:noProof/>
+            <w:webHidden/>
+          </w:rPr>
+          <w:fldChar w:fldCharType="end"/>
+        </w:r>
+      </w:hyperlink>
+    </w:p>
+    <w:p>
+      <w:pPr>
+        <w:pStyle w:val="TableofFigures"/>
+        <w:tabs>
+          <w:tab w:val="right" w:leader="dot" w:pos="9062"/>
+        </w:tabs>
+        <w:rPr>
+          <w:rFonts w:eastAsiaTheme="minorEastAsia"/>
+          <w:noProof/>
+          <w:sz w:val="24"/>
+          <w:szCs w:val="24"/>
+          <w:lang w:eastAsia="fr-FR"/>
+        </w:rPr>
+      </w:pPr>
+      <w:hyperlink w:anchor="_Toc226412944" w:history="1">
+        <w:r>
+          <w:rPr>
+            <w:rStyle w:val="Hyperlink"/>
+            <w:rFonts w:asciiTheme="majorBidi" w:hAnsiTheme="majorBidi" w:cstheme="majorBidi"/>
+            <w:noProof/>
+          </w:rPr>
+          <w:t>Figure 11: Logo  du site web</w:t>
+        </w:r>
+        <w:r>
+          <w:rPr>
+            <w:noProof/>
+            <w:webHidden/>
+          </w:rPr>
+          <w:tab/>
+        </w:r>
+        <w:r>
+          <w:rPr>
+            <w:noProof/>
+            <w:webHidden/>
+          </w:rPr>
+          <w:fldChar w:fldCharType="begin"/>
+        </w:r>
+        <w:r>
+          <w:rPr>
+            <w:noProof/>
+            <w:webHidden/>
+          </w:rPr>
+          <w:instrText xml:space="preserve"> PAGEREF _Toc226412944 \h </w:instrText>
         </w:r>
         <w:r>
           <w:rPr>
@@ -6024,13 +6028,13 @@
           <w:lang w:eastAsia="fr-FR"/>
         </w:rPr>
       </w:pPr>
-      <w:hyperlink w:anchor="_Toc226240799" w:history="1">
+      <w:hyperlink w:anchor="_Toc226412945" w:history="1">
         <w:r>
           <w:rPr>
             <w:rStyle w:val="Hyperlink"/>
             <w:noProof/>
           </w:rPr>
-          <w:t>Figure 12: l'explication du logo</w:t>
+          <w:t>Figure 12: La typographie</w:t>
         </w:r>
         <w:r>
           <w:rPr>
@@ -6051,7 +6055,7 @@
             <w:noProof/>
             <w:webHidden/>
           </w:rPr>
-          <w:instrText xml:space="preserve"> PAGEREF _Toc226240799 \h </w:instrText>
+          <w:instrText xml:space="preserve"> PAGEREF _Toc226412945 \h </w:instrText>
         </w:r>
         <w:r>
           <w:rPr>
@@ -6096,13 +6100,13 @@
           <w:lang w:eastAsia="fr-FR"/>
         </w:rPr>
       </w:pPr>
-      <w:hyperlink w:anchor="_Toc226240800" w:history="1">
+      <w:hyperlink w:anchor="_Toc226412946" w:history="1">
         <w:r>
           <w:rPr>
             <w:rStyle w:val="Hyperlink"/>
             <w:noProof/>
           </w:rPr>
-          <w:t>Figure 13: Google Analytics</w:t>
+          <w:t>Figure 13: la palette de couleurs</w:t>
         </w:r>
         <w:r>
           <w:rPr>
@@ -6123,7 +6127,7 @@
             <w:noProof/>
             <w:webHidden/>
           </w:rPr>
-          <w:instrText xml:space="preserve"> PAGEREF _Toc226240800 \h </w:instrText>
+          <w:instrText xml:space="preserve"> PAGEREF _Toc226412946 \h </w:instrText>
         </w:r>
         <w:r>
           <w:rPr>
@@ -6168,13 +6172,13 @@
           <w:lang w:eastAsia="fr-FR"/>
         </w:rPr>
       </w:pPr>
-      <w:hyperlink w:anchor="_Toc226240801" w:history="1">
+      <w:hyperlink w:anchor="_Toc226412947" w:history="1">
         <w:r>
           <w:rPr>
             <w:rStyle w:val="Hyperlink"/>
             <w:noProof/>
           </w:rPr>
-          <w:t>Figure 14: Ahrefs</w:t>
+          <w:t>Figure 14: l'explication du logo</w:t>
         </w:r>
         <w:r>
           <w:rPr>
@@ -6195,7 +6199,7 @@
             <w:noProof/>
             <w:webHidden/>
           </w:rPr>
-          <w:instrText xml:space="preserve"> PAGEREF _Toc226240801 \h </w:instrText>
+          <w:instrText xml:space="preserve"> PAGEREF _Toc226412947 \h </w:instrText>
         </w:r>
         <w:r>
           <w:rPr>
@@ -6240,13 +6244,13 @@
           <w:lang w:eastAsia="fr-FR"/>
         </w:rPr>
       </w:pPr>
-      <w:hyperlink w:anchor="_Toc226240802" w:history="1">
+      <w:hyperlink w:anchor="_Toc226412948" w:history="1">
         <w:r>
           <w:rPr>
             <w:rStyle w:val="Hyperlink"/>
             <w:noProof/>
           </w:rPr>
-          <w:t>Figure 15: Chatgpt</w:t>
+          <w:t>Figure 15: Google Analytics</w:t>
         </w:r>
         <w:r>
           <w:rPr>
@@ -6267,79 +6271,7 @@
             <w:noProof/>
             <w:webHidden/>
           </w:rPr>
-          <w:instrText xml:space="preserve"> PAGEREF _Toc226240802 \h </w:instrText>
-        </w:r>
-        <w:r>
-          <w:rPr>
-            <w:noProof/>
-            <w:webHidden/>
-          </w:rPr>
-        </w:r>
-        <w:r>
-          <w:rPr>
-            <w:noProof/>
-            <w:webHidden/>
-          </w:rPr>
-          <w:fldChar w:fldCharType="separate"/>
-        </w:r>
-        <w:r>
-          <w:rPr>
-            <w:noProof/>
-            <w:webHidden/>
-          </w:rPr>
-          <w:t>24</w:t>
-        </w:r>
-        <w:r>
-          <w:rPr>
-            <w:noProof/>
-            <w:webHidden/>
-          </w:rPr>
-          <w:fldChar w:fldCharType="end"/>
-        </w:r>
-      </w:hyperlink>
-    </w:p>
-    <w:p>
-      <w:pPr>
-        <w:pStyle w:val="TableofFigures"/>
-        <w:tabs>
-          <w:tab w:val="right" w:leader="dot" w:pos="9062"/>
-        </w:tabs>
-        <w:rPr>
-          <w:rFonts w:eastAsiaTheme="minorEastAsia"/>
-          <w:noProof/>
-          <w:sz w:val="24"/>
-          <w:szCs w:val="24"/>
-          <w:lang w:eastAsia="fr-FR"/>
-        </w:rPr>
-      </w:pPr>
-      <w:hyperlink w:anchor="_Toc226240803" w:history="1">
-        <w:r>
-          <w:rPr>
-            <w:rStyle w:val="Hyperlink"/>
-            <w:noProof/>
-          </w:rPr>
-          <w:t>Figure 16: Logo de VS Code</w:t>
-        </w:r>
-        <w:r>
-          <w:rPr>
-            <w:noProof/>
-            <w:webHidden/>
-          </w:rPr>
-          <w:tab/>
-        </w:r>
-        <w:r>
-          <w:rPr>
-            <w:noProof/>
-            <w:webHidden/>
-          </w:rPr>
-          <w:fldChar w:fldCharType="begin"/>
-        </w:r>
-        <w:r>
-          <w:rPr>
-            <w:noProof/>
-            <w:webHidden/>
-          </w:rPr>
-          <w:instrText xml:space="preserve"> PAGEREF _Toc226240803 \h </w:instrText>
+          <w:instrText xml:space="preserve"> PAGEREF _Toc226412948 \h </w:instrText>
         </w:r>
         <w:r>
           <w:rPr>
@@ -6384,13 +6316,13 @@
           <w:lang w:eastAsia="fr-FR"/>
         </w:rPr>
       </w:pPr>
-      <w:hyperlink w:anchor="_Toc226240804" w:history="1">
+      <w:hyperlink w:anchor="_Toc226412949" w:history="1">
         <w:r>
           <w:rPr>
             <w:rStyle w:val="Hyperlink"/>
             <w:noProof/>
           </w:rPr>
-          <w:t>Figure 17: Logo de git</w:t>
+          <w:t>Figure 16: Ahrefs</w:t>
         </w:r>
         <w:r>
           <w:rPr>
@@ -6411,7 +6343,7 @@
             <w:noProof/>
             <w:webHidden/>
           </w:rPr>
-          <w:instrText xml:space="preserve"> PAGEREF _Toc226240804 \h </w:instrText>
+          <w:instrText xml:space="preserve"> PAGEREF _Toc226412949 \h </w:instrText>
         </w:r>
         <w:r>
           <w:rPr>
@@ -6456,13 +6388,13 @@
           <w:lang w:eastAsia="fr-FR"/>
         </w:rPr>
       </w:pPr>
-      <w:hyperlink w:anchor="_Toc226240805" w:history="1">
+      <w:hyperlink w:anchor="_Toc226412950" w:history="1">
         <w:r>
           <w:rPr>
             <w:rStyle w:val="Hyperlink"/>
             <w:noProof/>
           </w:rPr>
-          <w:t>Figure 18: Logo de GitHub</w:t>
+          <w:t>Figure 17: Chatgpt</w:t>
         </w:r>
         <w:r>
           <w:rPr>
@@ -6483,7 +6415,7 @@
             <w:noProof/>
             <w:webHidden/>
           </w:rPr>
-          <w:instrText xml:space="preserve"> PAGEREF _Toc226240805 \h </w:instrText>
+          <w:instrText xml:space="preserve"> PAGEREF _Toc226412950 \h </w:instrText>
         </w:r>
         <w:r>
           <w:rPr>
@@ -6528,13 +6460,13 @@
           <w:lang w:eastAsia="fr-FR"/>
         </w:rPr>
       </w:pPr>
-      <w:hyperlink w:anchor="_Toc226240806" w:history="1">
+      <w:hyperlink w:anchor="_Toc226412951" w:history="1">
         <w:r>
           <w:rPr>
             <w:rStyle w:val="Hyperlink"/>
             <w:noProof/>
           </w:rPr>
-          <w:t>Figure 19: Diagramme de classes</w:t>
+          <w:t>Figure 18: Logo de VS Code</w:t>
         </w:r>
         <w:r>
           <w:rPr>
@@ -6555,7 +6487,7 @@
             <w:noProof/>
             <w:webHidden/>
           </w:rPr>
-          <w:instrText xml:space="preserve"> PAGEREF _Toc226240806 \h </w:instrText>
+          <w:instrText xml:space="preserve"> PAGEREF _Toc226412951 \h </w:instrText>
         </w:r>
         <w:r>
           <w:rPr>
@@ -6600,13 +6532,13 @@
           <w:lang w:eastAsia="fr-FR"/>
         </w:rPr>
       </w:pPr>
-      <w:hyperlink w:anchor="_Toc226240807" w:history="1">
+      <w:hyperlink w:anchor="_Toc226412952" w:history="1">
         <w:r>
           <w:rPr>
             <w:rStyle w:val="Hyperlink"/>
             <w:noProof/>
           </w:rPr>
-          <w:t>Figure 20: Design sur Figma</w:t>
+          <w:t>Figure 19: Logo de git</w:t>
         </w:r>
         <w:r>
           <w:rPr>
@@ -6627,7 +6559,7 @@
             <w:noProof/>
             <w:webHidden/>
           </w:rPr>
-          <w:instrText xml:space="preserve"> PAGEREF _Toc226240807 \h </w:instrText>
+          <w:instrText xml:space="preserve"> PAGEREF _Toc226412952 \h </w:instrText>
         </w:r>
         <w:r>
           <w:rPr>
@@ -6647,7 +6579,7 @@
             <w:noProof/>
             <w:webHidden/>
           </w:rPr>
-          <w:t>34</w:t>
+          <w:t>26</w:t>
         </w:r>
         <w:r>
           <w:rPr>
@@ -6672,13 +6604,13 @@
           <w:lang w:eastAsia="fr-FR"/>
         </w:rPr>
       </w:pPr>
-      <w:hyperlink w:anchor="_Toc226240808" w:history="1">
+      <w:hyperlink w:anchor="_Toc226412953" w:history="1">
         <w:r>
           <w:rPr>
             <w:rStyle w:val="Hyperlink"/>
             <w:noProof/>
           </w:rPr>
-          <w:t>Figure 21: Page d'accueil  du site</w:t>
+          <w:t>Figure 20: Logo de GitHub</w:t>
         </w:r>
         <w:r>
           <w:rPr>
@@ -6699,7 +6631,7 @@
             <w:noProof/>
             <w:webHidden/>
           </w:rPr>
-          <w:instrText xml:space="preserve"> PAGEREF _Toc226240808 \h </w:instrText>
+          <w:instrText xml:space="preserve"> PAGEREF _Toc226412953 \h </w:instrText>
         </w:r>
         <w:r>
           <w:rPr>
@@ -6719,7 +6651,7 @@
             <w:noProof/>
             <w:webHidden/>
           </w:rPr>
-          <w:t>34</w:t>
+          <w:t>26</w:t>
         </w:r>
         <w:r>
           <w:rPr>
@@ -6744,13 +6676,13 @@
           <w:lang w:eastAsia="fr-FR"/>
         </w:rPr>
       </w:pPr>
-      <w:hyperlink w:anchor="_Toc226240809" w:history="1">
+      <w:hyperlink w:anchor="_Toc226412954" w:history="1">
         <w:r>
           <w:rPr>
             <w:rStyle w:val="Hyperlink"/>
             <w:noProof/>
           </w:rPr>
-          <w:t>Figure 22: Page du catalogue des voitures</w:t>
+          <w:t>Figure 21: Diagramme de classes</w:t>
         </w:r>
         <w:r>
           <w:rPr>
@@ -6771,7 +6703,79 @@
             <w:noProof/>
             <w:webHidden/>
           </w:rPr>
-          <w:instrText xml:space="preserve"> PAGEREF _Toc226240809 \h </w:instrText>
+          <w:instrText xml:space="preserve"> PAGEREF _Toc226412954 \h </w:instrText>
+        </w:r>
+        <w:r>
+          <w:rPr>
+            <w:noProof/>
+            <w:webHidden/>
+          </w:rPr>
+        </w:r>
+        <w:r>
+          <w:rPr>
+            <w:noProof/>
+            <w:webHidden/>
+          </w:rPr>
+          <w:fldChar w:fldCharType="separate"/>
+        </w:r>
+        <w:r>
+          <w:rPr>
+            <w:noProof/>
+            <w:webHidden/>
+          </w:rPr>
+          <w:t>27</w:t>
+        </w:r>
+        <w:r>
+          <w:rPr>
+            <w:noProof/>
+            <w:webHidden/>
+          </w:rPr>
+          <w:fldChar w:fldCharType="end"/>
+        </w:r>
+      </w:hyperlink>
+    </w:p>
+    <w:p>
+      <w:pPr>
+        <w:pStyle w:val="TableofFigures"/>
+        <w:tabs>
+          <w:tab w:val="right" w:leader="dot" w:pos="9062"/>
+        </w:tabs>
+        <w:rPr>
+          <w:rFonts w:eastAsiaTheme="minorEastAsia"/>
+          <w:noProof/>
+          <w:sz w:val="24"/>
+          <w:szCs w:val="24"/>
+          <w:lang w:eastAsia="fr-FR"/>
+        </w:rPr>
+      </w:pPr>
+      <w:hyperlink w:anchor="_Toc226412955" w:history="1">
+        <w:r>
+          <w:rPr>
+            <w:rStyle w:val="Hyperlink"/>
+            <w:noProof/>
+          </w:rPr>
+          <w:t>Figure 22: Design sur Figma</w:t>
+        </w:r>
+        <w:r>
+          <w:rPr>
+            <w:noProof/>
+            <w:webHidden/>
+          </w:rPr>
+          <w:tab/>
+        </w:r>
+        <w:r>
+          <w:rPr>
+            <w:noProof/>
+            <w:webHidden/>
+          </w:rPr>
+          <w:fldChar w:fldCharType="begin"/>
+        </w:r>
+        <w:r>
+          <w:rPr>
+            <w:noProof/>
+            <w:webHidden/>
+          </w:rPr>
+          <w:instrText xml:space="preserve"> PAGEREF _Toc226412955 \h </w:instrText>
         </w:r>
         <w:r>
           <w:rPr>
@@ -6816,13 +6820,13 @@
           <w:lang w:eastAsia="fr-FR"/>
         </w:rPr>
       </w:pPr>
-      <w:hyperlink w:anchor="_Toc226240810" w:history="1">
+      <w:hyperlink w:anchor="_Toc226412956" w:history="1">
         <w:r>
           <w:rPr>
             <w:rStyle w:val="Hyperlink"/>
             <w:noProof/>
           </w:rPr>
-          <w:t>Figure 23: Page du Dashboard</w:t>
+          <w:t>Figure 23: Page d'accueil  du site</w:t>
         </w:r>
         <w:r>
           <w:rPr>
@@ -6843,7 +6847,79 @@
             <w:noProof/>
             <w:webHidden/>
           </w:rPr>
-          <w:instrText xml:space="preserve"> PAGEREF _Toc226240810 \h </w:instrText>
+          <w:instrText xml:space="preserve"> PAGEREF _Toc226412956 \h </w:instrText>
+        </w:r>
+        <w:r>
+          <w:rPr>
+            <w:noProof/>
+            <w:webHidden/>
+          </w:rPr>
+        </w:r>
+        <w:r>
+          <w:rPr>
+            <w:noProof/>
+            <w:webHidden/>
+          </w:rPr>
+          <w:fldChar w:fldCharType="separate"/>
+        </w:r>
+        <w:r>
+          <w:rPr>
+            <w:noProof/>
+            <w:webHidden/>
+          </w:rPr>
+          <w:t>35</w:t>
+        </w:r>
+        <w:r>
+          <w:rPr>
+            <w:noProof/>
+            <w:webHidden/>
+          </w:rPr>
+          <w:fldChar w:fldCharType="end"/>
+        </w:r>
+      </w:hyperlink>
+    </w:p>
+    <w:p>
+      <w:pPr>
+        <w:pStyle w:val="TableofFigures"/>
+        <w:tabs>
+          <w:tab w:val="right" w:leader="dot" w:pos="9062"/>
+        </w:tabs>
+        <w:rPr>
+          <w:rFonts w:eastAsiaTheme="minorEastAsia"/>
+          <w:noProof/>
+          <w:sz w:val="24"/>
+          <w:szCs w:val="24"/>
+          <w:lang w:eastAsia="fr-FR"/>
+        </w:rPr>
+      </w:pPr>
+      <w:hyperlink w:anchor="_Toc226412957" w:history="1">
+        <w:r>
+          <w:rPr>
+            <w:rStyle w:val="Hyperlink"/>
+            <w:noProof/>
+          </w:rPr>
+          <w:t>Figure 24: Page du catalogue des voitures</w:t>
+        </w:r>
+        <w:r>
+          <w:rPr>
+            <w:noProof/>
+            <w:webHidden/>
+          </w:rPr>
+          <w:tab/>
+        </w:r>
+        <w:r>
+          <w:rPr>
+            <w:noProof/>
+            <w:webHidden/>
+          </w:rPr>
+          <w:fldChar w:fldCharType="begin"/>
+        </w:r>
+        <w:r>
+          <w:rPr>
+            <w:noProof/>
+            <w:webHidden/>
+          </w:rPr>
+          <w:instrText xml:space="preserve"> PAGEREF _Toc226412957 \h </w:instrText>
         </w:r>
         <w:r>
           <w:rPr>
@@ -6888,13 +6964,13 @@
           <w:lang w:eastAsia="fr-FR"/>
         </w:rPr>
       </w:pPr>
-      <w:hyperlink w:anchor="_Toc226240811" w:history="1">
+      <w:hyperlink w:anchor="_Toc226412958" w:history="1">
         <w:r>
           <w:rPr>
             <w:rStyle w:val="Hyperlink"/>
             <w:noProof/>
           </w:rPr>
-          <w:t>Figure 24: Post Instagram N° 1</w:t>
+          <w:t>Figure 25: Page du Dashboard</w:t>
         </w:r>
         <w:r>
           <w:rPr>
@@ -6915,7 +6991,7 @@
             <w:noProof/>
             <w:webHidden/>
           </w:rPr>
-          <w:instrText xml:space="preserve"> PAGEREF _Toc226240811 \h </w:instrText>
+          <w:instrText xml:space="preserve"> PAGEREF _Toc226412958 \h </w:instrText>
         </w:r>
         <w:r>
           <w:rPr>
@@ -6960,13 +7036,13 @@
           <w:lang w:eastAsia="fr-FR"/>
         </w:rPr>
       </w:pPr>
-      <w:hyperlink w:anchor="_Toc226240812" w:history="1">
+      <w:hyperlink w:anchor="_Toc226412959" w:history="1">
         <w:r>
           <w:rPr>
             <w:rStyle w:val="Hyperlink"/>
             <w:noProof/>
           </w:rPr>
-          <w:t>Figure 25: Post Instagram N° 2</w:t>
+          <w:t>Figure 26: Post Instagram N° 1</w:t>
         </w:r>
         <w:r>
           <w:rPr>
@@ -6987,79 +7063,7 @@
             <w:noProof/>
             <w:webHidden/>
           </w:rPr>
-          <w:instrText xml:space="preserve"> PAGEREF _Toc226240812 \h </w:instrText>
-        </w:r>
-        <w:r>
-          <w:rPr>
-            <w:noProof/>
-            <w:webHidden/>
-          </w:rPr>
-        </w:r>
-        <w:r>
-          <w:rPr>
-            <w:noProof/>
-            <w:webHidden/>
-          </w:rPr>
-          <w:fldChar w:fldCharType="separate"/>
-        </w:r>
-        <w:r>
-          <w:rPr>
-            <w:noProof/>
-            <w:webHidden/>
-          </w:rPr>
-          <w:t>37</w:t>
-        </w:r>
-        <w:r>
-          <w:rPr>
-            <w:noProof/>
-            <w:webHidden/>
-          </w:rPr>
-          <w:fldChar w:fldCharType="end"/>
-        </w:r>
-      </w:hyperlink>
-    </w:p>
-    <w:p>
-      <w:pPr>
-        <w:pStyle w:val="TableofFigures"/>
-        <w:tabs>
-          <w:tab w:val="right" w:leader="dot" w:pos="9062"/>
-        </w:tabs>
-        <w:rPr>
-          <w:rFonts w:eastAsiaTheme="minorEastAsia"/>
-          <w:noProof/>
-          <w:sz w:val="24"/>
-          <w:szCs w:val="24"/>
-          <w:lang w:eastAsia="fr-FR"/>
-        </w:rPr>
-      </w:pPr>
-      <w:hyperlink w:anchor="_Toc226240813" w:history="1">
-        <w:r>
-          <w:rPr>
-            <w:rStyle w:val="Hyperlink"/>
-            <w:noProof/>
-          </w:rPr>
-          <w:t>Figure 26: Post Instagram N° 3</w:t>
-        </w:r>
-        <w:r>
-          <w:rPr>
-            <w:noProof/>
-            <w:webHidden/>
-          </w:rPr>
-          <w:tab/>
-        </w:r>
-        <w:r>
-          <w:rPr>
-            <w:noProof/>
-            <w:webHidden/>
-          </w:rPr>
-          <w:fldChar w:fldCharType="begin"/>
-        </w:r>
-        <w:r>
-          <w:rPr>
-            <w:noProof/>
-            <w:webHidden/>
-          </w:rPr>
-          <w:instrText xml:space="preserve"> PAGEREF _Toc226240813 \h </w:instrText>
+          <w:instrText xml:space="preserve"> PAGEREF _Toc226412959 \h </w:instrText>
         </w:r>
         <w:r>
           <w:rPr>
@@ -7104,13 +7108,13 @@
           <w:lang w:eastAsia="fr-FR"/>
         </w:rPr>
       </w:pPr>
-      <w:hyperlink w:anchor="_Toc226240814" w:history="1">
+      <w:hyperlink w:anchor="_Toc226412960" w:history="1">
         <w:r>
           <w:rPr>
             <w:rStyle w:val="Hyperlink"/>
             <w:noProof/>
           </w:rPr>
-          <w:t>Figure 27: la Page Instagram</w:t>
+          <w:t>Figure 27: Post Instagram N° 2</w:t>
         </w:r>
         <w:r>
           <w:rPr>
@@ -7131,7 +7135,7 @@
             <w:noProof/>
             <w:webHidden/>
           </w:rPr>
-          <w:instrText xml:space="preserve"> PAGEREF _Toc226240814 \h </w:instrText>
+          <w:instrText xml:space="preserve"> PAGEREF _Toc226412960 \h </w:instrText>
         </w:r>
         <w:r>
           <w:rPr>
@@ -7176,13 +7180,13 @@
           <w:lang w:eastAsia="fr-FR"/>
         </w:rPr>
       </w:pPr>
-      <w:hyperlink w:anchor="_Toc226240815" w:history="1">
+      <w:hyperlink w:anchor="_Toc226412961" w:history="1">
         <w:r>
           <w:rPr>
             <w:rStyle w:val="Hyperlink"/>
             <w:noProof/>
           </w:rPr>
-          <w:t>Figure 28: Instagram Insights</w:t>
+          <w:t>Figure 28: Post Instagram N° 3</w:t>
         </w:r>
         <w:r>
           <w:rPr>
@@ -7203,7 +7207,7 @@
             <w:noProof/>
             <w:webHidden/>
           </w:rPr>
-          <w:instrText xml:space="preserve"> PAGEREF _Toc226240815 \h </w:instrText>
+          <w:instrText xml:space="preserve"> PAGEREF _Toc226412961 \h </w:instrText>
         </w:r>
         <w:r>
           <w:rPr>
@@ -7235,6 +7239,150 @@
       </w:hyperlink>
     </w:p>
     <w:p>
+      <w:pPr>
+        <w:pStyle w:val="TableofFigures"/>
+        <w:tabs>
+          <w:tab w:val="right" w:leader="dot" w:pos="9062"/>
+        </w:tabs>
+        <w:rPr>
+          <w:rFonts w:eastAsiaTheme="minorEastAsia"/>
+          <w:noProof/>
+          <w:sz w:val="24"/>
+          <w:szCs w:val="24"/>
+          <w:lang w:eastAsia="fr-FR"/>
+        </w:rPr>
+      </w:pPr>
+      <w:hyperlink w:anchor="_Toc226412962" w:history="1">
+        <w:r>
+          <w:rPr>
+            <w:rStyle w:val="Hyperlink"/>
+            <w:noProof/>
+          </w:rPr>
+          <w:t>Figure 29: la Page Instagram</w:t>
+        </w:r>
+        <w:r>
+          <w:rPr>
+            <w:noProof/>
+            <w:webHidden/>
+          </w:rPr>
+          <w:tab/>
+        </w:r>
+        <w:r>
+          <w:rPr>
+            <w:noProof/>
+            <w:webHidden/>
+          </w:rPr>
+          <w:fldChar w:fldCharType="begin"/>
+        </w:r>
+        <w:r>
+          <w:rPr>
+            <w:noProof/>
+            <w:webHidden/>
+          </w:rPr>
+          <w:instrText xml:space="preserve"> PAGEREF _Toc226412962 \h </w:instrText>
+        </w:r>
+        <w:r>
+          <w:rPr>
+            <w:noProof/>
+            <w:webHidden/>
+          </w:rPr>
+        </w:r>
+        <w:r>
+          <w:rPr>
+            <w:noProof/>
+            <w:webHidden/>
+          </w:rPr>
+          <w:fldChar w:fldCharType="separate"/>
+        </w:r>
+        <w:r>
+          <w:rPr>
+            <w:noProof/>
+            <w:webHidden/>
+          </w:rPr>
+          <w:t>39</w:t>
+        </w:r>
+        <w:r>
+          <w:rPr>
+            <w:noProof/>
+            <w:webHidden/>
+          </w:rPr>
+          <w:fldChar w:fldCharType="end"/>
+        </w:r>
+      </w:hyperlink>
+    </w:p>
+    <w:p>
+      <w:pPr>
+        <w:pStyle w:val="TableofFigures"/>
+        <w:tabs>
+          <w:tab w:val="right" w:leader="dot" w:pos="9062"/>
+        </w:tabs>
+        <w:rPr>
+          <w:rFonts w:eastAsiaTheme="minorEastAsia"/>
+          <w:noProof/>
+          <w:sz w:val="24"/>
+          <w:szCs w:val="24"/>
+          <w:lang w:eastAsia="fr-FR"/>
+        </w:rPr>
+      </w:pPr>
+      <w:hyperlink w:anchor="_Toc226412963" w:history="1">
+        <w:r>
+          <w:rPr>
+            <w:rStyle w:val="Hyperlink"/>
+            <w:noProof/>
+          </w:rPr>
+          <w:t>Figure 30: Instagram Insights</w:t>
+        </w:r>
+        <w:r>
+          <w:rPr>
+            <w:noProof/>
+            <w:webHidden/>
+          </w:rPr>
+          <w:tab/>
+        </w:r>
+        <w:r>
+          <w:rPr>
+            <w:noProof/>
+            <w:webHidden/>
+          </w:rPr>
+          <w:fldChar w:fldCharType="begin"/>
+        </w:r>
+        <w:r>
+          <w:rPr>
+            <w:noProof/>
+            <w:webHidden/>
+          </w:rPr>
+          <w:instrText xml:space="preserve"> PAGEREF _Toc226412963 \h </w:instrText>
+        </w:r>
+        <w:r>
+          <w:rPr>
+            <w:noProof/>
+            <w:webHidden/>
+          </w:rPr>
+        </w:r>
+        <w:r>
+          <w:rPr>
+            <w:noProof/>
+            <w:webHidden/>
+          </w:rPr>
+          <w:fldChar w:fldCharType="separate"/>
+        </w:r>
+        <w:r>
+          <w:rPr>
+            <w:noProof/>
+            <w:webHidden/>
+          </w:rPr>
+          <w:t>40</w:t>
+        </w:r>
+        <w:r>
+          <w:rPr>
+            <w:noProof/>
+            <w:webHidden/>
+          </w:rPr>
+          <w:fldChar w:fldCharType="end"/>
+        </w:r>
+      </w:hyperlink>
+    </w:p>
+    <w:p>
       <w:r>
         <w:fldChar w:fldCharType="end"/>
       </w:r>
@@ -7245,13 +7393,14 @@
     <w:p/>
     <w:p/>
     <w:p/>
+    <w:p/>
+    <w:p/>
     <w:p>
       <w:pPr>
         <w:pStyle w:val="Heading1"/>
-        <w:spacing w:line="360" w:lineRule="auto"/>
         <w:jc w:val="center"/>
         <w:rPr>
-          <w:rFonts w:asciiTheme="majorBidi" w:hAnsiTheme="majorBidi"/>
+          <w:rFonts w:ascii="Times New Roman" w:hAnsi="Times New Roman" w:cs="Times New Roman"/>
           <w:b/>
           <w:bCs/>
           <w:sz w:val="32"/>
@@ -7259,22 +7408,7 @@
           <w:u w:val="single"/>
         </w:rPr>
       </w:pPr>
-    </w:p>
-    <w:p/>
-    <w:p>
-      <w:pPr>
-        <w:pStyle w:val="Heading1"/>
-        <w:jc w:val="center"/>
-        <w:rPr>
-          <w:rFonts w:ascii="Times New Roman" w:hAnsi="Times New Roman" w:cs="Times New Roman"/>
-          <w:b/>
-          <w:bCs/>
-          <w:sz w:val="32"/>
-          <w:szCs w:val="32"/>
-          <w:u w:val="single"/>
-        </w:rPr>
-      </w:pPr>
-      <w:bookmarkStart w:id="2" w:name="_Toc226240745"/>
+      <w:bookmarkStart w:id="2" w:name="_Toc226412966"/>
       <w:r>
         <w:rPr>
           <w:rFonts w:ascii="Times New Roman" w:hAnsi="Times New Roman" w:cs="Times New Roman"/>
@@ -7982,7 +8116,7 @@
           <w:u w:val="single"/>
         </w:rPr>
       </w:pPr>
-      <w:bookmarkStart w:id="3" w:name="_Toc226240746"/>
+      <w:bookmarkStart w:id="3" w:name="_Toc226412967"/>
       <w:r>
         <w:rPr>
           <w:rFonts w:asciiTheme="majorBidi" w:hAnsiTheme="majorBidi"/>
@@ -8412,7 +8546,7 @@
           <w:u w:val="single"/>
         </w:rPr>
       </w:pPr>
-      <w:bookmarkStart w:id="4" w:name="_Toc226240747"/>
+      <w:bookmarkStart w:id="4" w:name="_Toc226412968"/>
       <w:r>
         <w:rPr>
           <w:rFonts w:asciiTheme="majorBidi" w:hAnsiTheme="majorBidi"/>
@@ -9119,7 +9253,7 @@
           <w:szCs w:val="32"/>
         </w:rPr>
       </w:pPr>
-      <w:bookmarkStart w:id="5" w:name="_Toc226240748"/>
+      <w:bookmarkStart w:id="5" w:name="_Toc226412969"/>
       <w:r>
         <w:rPr>
           <w:rFonts w:asciiTheme="majorBidi" w:hAnsiTheme="majorBidi"/>
@@ -9187,7 +9321,7 @@
           <w:u w:val="single"/>
         </w:rPr>
       </w:pPr>
-      <w:bookmarkStart w:id="6" w:name="_Toc226240749"/>
+      <w:bookmarkStart w:id="6" w:name="_Toc226412970"/>
       <w:r>
         <w:rPr>
           <w:rFonts w:asciiTheme="majorBidi" w:hAnsiTheme="majorBidi"/>
@@ -9428,7 +9562,7 @@
           <w:u w:val="single"/>
         </w:rPr>
       </w:pPr>
-      <w:bookmarkStart w:id="7" w:name="_Toc226240750"/>
+      <w:bookmarkStart w:id="7" w:name="_Toc226412971"/>
       <w:r>
         <w:rPr>
           <w:rFonts w:asciiTheme="majorBidi" w:hAnsiTheme="majorBidi"/>
@@ -9533,7 +9667,7 @@
           <w:u w:val="single"/>
         </w:rPr>
       </w:pPr>
-      <w:bookmarkStart w:id="8" w:name="_Toc226240751"/>
+      <w:bookmarkStart w:id="8" w:name="_Toc226412972"/>
       <w:r>
         <w:rPr>
           <w:rFonts w:asciiTheme="majorBidi" w:hAnsiTheme="majorBidi"/>
@@ -9664,7 +9798,7 @@
           <w:u w:val="single"/>
         </w:rPr>
       </w:pPr>
-      <w:bookmarkStart w:id="9" w:name="_Toc226240752"/>
+      <w:bookmarkStart w:id="9" w:name="_Toc226412973"/>
       <w:r>
         <w:rPr>
           <w:rFonts w:asciiTheme="majorBidi" w:hAnsiTheme="majorBidi"/>
@@ -9955,7 +10089,7 @@
           <w:u w:val="single"/>
         </w:rPr>
       </w:pPr>
-      <w:bookmarkStart w:id="10" w:name="_Toc226240753"/>
+      <w:bookmarkStart w:id="10" w:name="_Toc226412974"/>
       <w:r>
         <w:rPr>
           <w:rFonts w:asciiTheme="majorBidi" w:hAnsiTheme="majorBidi"/>
@@ -10681,7 +10815,7 @@
           <w:szCs w:val="32"/>
         </w:rPr>
       </w:pPr>
-      <w:bookmarkStart w:id="11" w:name="_Toc226240754"/>
+      <w:bookmarkStart w:id="11" w:name="_Toc226412975"/>
       <w:r>
         <w:rPr>
           <w:rFonts w:asciiTheme="majorBidi" w:hAnsiTheme="majorBidi"/>
@@ -10719,7 +10853,7 @@
           <w:u w:val="single"/>
         </w:rPr>
       </w:pPr>
-      <w:bookmarkStart w:id="12" w:name="_Toc226240755"/>
+      <w:bookmarkStart w:id="12" w:name="_Toc226412976"/>
       <w:r>
         <w:rPr>
           <w:rFonts w:asciiTheme="majorBidi" w:hAnsiTheme="majorBidi"/>
@@ -11083,7 +11217,7 @@
           <w:lang w:eastAsia="fr-FR"/>
         </w:rPr>
       </w:pPr>
-      <w:bookmarkStart w:id="13" w:name="_Toc226240756"/>
+      <w:bookmarkStart w:id="13" w:name="_Toc226412977"/>
       <w:r>
         <w:rPr>
           <w:rFonts w:asciiTheme="majorBidi" w:eastAsiaTheme="minorHAnsi" w:hAnsiTheme="majorBidi"/>
@@ -11282,7 +11416,7 @@
           <w:u w:val="single"/>
         </w:rPr>
       </w:pPr>
-      <w:bookmarkStart w:id="14" w:name="_Toc226240757"/>
+      <w:bookmarkStart w:id="14" w:name="_Toc226412978"/>
       <w:r>
         <w:rPr>
           <w:rFonts w:asciiTheme="majorBidi" w:hAnsiTheme="majorBidi"/>
@@ -11473,7 +11607,7 @@
           <w:u w:val="single"/>
         </w:rPr>
       </w:pPr>
-      <w:bookmarkStart w:id="15" w:name="_Toc226240758"/>
+      <w:bookmarkStart w:id="15" w:name="_Toc226412979"/>
       <w:r>
         <w:rPr>
           <w:rFonts w:asciiTheme="majorBidi" w:hAnsiTheme="majorBidi"/>
@@ -11577,7 +11711,7 @@
           <w:rFonts w:asciiTheme="majorBidi" w:hAnsiTheme="majorBidi" w:cstheme="majorBidi"/>
         </w:rPr>
       </w:pPr>
-      <w:bookmarkStart w:id="16" w:name="_Toc226240788"/>
+      <w:bookmarkStart w:id="16" w:name="_Toc226412934"/>
       <w:r>
         <w:rPr>
           <w:rFonts w:asciiTheme="majorBidi" w:hAnsiTheme="majorBidi" w:cstheme="majorBidi"/>
@@ -12167,7 +12301,7 @@
           <w:szCs w:val="32"/>
         </w:rPr>
       </w:pPr>
-      <w:bookmarkStart w:id="17" w:name="_Toc226240759"/>
+      <w:bookmarkStart w:id="17" w:name="_Toc226412980"/>
       <w:r>
         <w:rPr>
           <w:rFonts w:asciiTheme="majorBidi" w:hAnsiTheme="majorBidi"/>
@@ -12195,7 +12329,7 @@
           <w:u w:val="single"/>
         </w:rPr>
       </w:pPr>
-      <w:bookmarkStart w:id="18" w:name="_Toc226240760"/>
+      <w:bookmarkStart w:id="18" w:name="_Toc226412981"/>
       <w:r>
         <w:rPr>
           <w:rFonts w:asciiTheme="majorBidi" w:hAnsiTheme="majorBidi"/>
@@ -12430,7 +12564,7 @@
           <w:rFonts w:asciiTheme="majorBidi" w:hAnsiTheme="majorBidi" w:cstheme="majorBidi"/>
         </w:rPr>
       </w:pPr>
-      <w:bookmarkStart w:id="19" w:name="_Toc226240789"/>
+      <w:bookmarkStart w:id="19" w:name="_Toc226412935"/>
       <w:r>
         <w:rPr>
           <w:rFonts w:asciiTheme="majorBidi" w:hAnsiTheme="majorBidi" w:cstheme="majorBidi"/>
@@ -12510,7 +12644,7 @@
           <w:u w:val="single"/>
         </w:rPr>
       </w:pPr>
-      <w:bookmarkStart w:id="20" w:name="_Toc226240761"/>
+      <w:bookmarkStart w:id="20" w:name="_Toc226412982"/>
       <w:r>
         <w:rPr>
           <w:rFonts w:asciiTheme="majorBidi" w:hAnsiTheme="majorBidi"/>
@@ -12661,7 +12795,7 @@
           <w:rFonts w:asciiTheme="majorBidi" w:hAnsiTheme="majorBidi"/>
         </w:rPr>
       </w:pPr>
-      <w:bookmarkStart w:id="21" w:name="_Toc226240762"/>
+      <w:bookmarkStart w:id="21" w:name="_Toc226412983"/>
       <w:r>
         <w:rPr>
           <w:rFonts w:asciiTheme="majorBidi" w:hAnsiTheme="majorBidi"/>
@@ -12790,11 +12924,9 @@
         <w:jc w:val="center"/>
         <w:rPr>
           <w:rFonts w:asciiTheme="majorBidi" w:hAnsiTheme="majorBidi" w:cstheme="majorBidi"/>
-          <w:sz w:val="24"/>
-          <w:szCs w:val="24"/>
-        </w:rPr>
-      </w:pPr>
-      <w:bookmarkStart w:id="22" w:name="_Toc226240790"/>
+        </w:rPr>
+      </w:pPr>
+      <w:bookmarkStart w:id="22" w:name="_Toc226412936"/>
       <w:r>
         <w:rPr>
           <w:rFonts w:asciiTheme="majorBidi" w:hAnsiTheme="majorBidi" w:cstheme="majorBidi"/>
@@ -12837,9 +12969,329 @@
         <w:rPr>
           <w:rFonts w:asciiTheme="majorBidi" w:hAnsiTheme="majorBidi" w:cstheme="majorBidi"/>
         </w:rPr>
-        <w:t>: Logo de React</w:t>
+        <w:t xml:space="preserve">: Logo de </w:t>
+      </w:r>
+      <w:proofErr w:type="spellStart"/>
+      <w:r>
+        <w:rPr>
+          <w:rFonts w:asciiTheme="majorBidi" w:hAnsiTheme="majorBidi" w:cstheme="majorBidi"/>
+        </w:rPr>
+        <w:t>React</w:t>
       </w:r>
       <w:bookmarkEnd w:id="22"/>
+      <w:proofErr w:type="spellEnd"/>
+    </w:p>
+    <w:p>
+      <w:pPr>
+        <w:keepNext/>
+        <w:spacing w:line="360" w:lineRule="auto"/>
+        <w:jc w:val="both"/>
+        <w:rPr>
+          <w:rFonts w:ascii="Times New Roman" w:hAnsi="Times New Roman" w:cs="Times New Roman"/>
+          <w:sz w:val="24"/>
+          <w:szCs w:val="24"/>
+        </w:rPr>
+      </w:pPr>
+      <w:r>
+        <w:rPr>
+          <w:rFonts w:ascii="Times New Roman" w:hAnsi="Times New Roman" w:cs="Times New Roman"/>
+          <w:sz w:val="24"/>
+          <w:szCs w:val="24"/>
+        </w:rPr>
+        <w:t>HTML (HyperText Markup Language) constitue le langage fondamental pour structurer et organiser le contenu des pages web. Il permet de définir avec précision les éléments essentiels d’une page, tels que les titres, les paragraphes, les listes, les boutons et les formulaires, assurant ainsi une présentation claire et cohérente de l’information. Dans le cadre de ce projet, HTML a été utilisé pour concevoir l’interface utilisateur de l’application web, en posant les bases de sa structure et en garantissant que chaque composant soit correctement agencé et facilement accessible aux utilisateurs. Cette étape a été cruciale pour assurer une expérience utilisateur fluide et intuitive, tout en facilitant l’intégration des autres technologies, comme le CSS et le JavaScript, qui viennent enrichir l’interactivité et le design de l’application.</w:t>
+      </w:r>
+    </w:p>
+    <w:p>
+      <w:pPr>
+        <w:keepNext/>
+        <w:jc w:val="center"/>
+      </w:pPr>
+      <w:r>
+        <w:rPr>
+          <w:i/>
+          <w:iCs/>
+          <w:noProof/>
+          <w:sz w:val="32"/>
+          <w:szCs w:val="32"/>
+        </w:rPr>
+        <w:drawing>
+          <wp:inline distT="0" distB="0" distL="0" distR="0" wp14:anchorId="15126BB0" wp14:editId="7EBA04D8">
+            <wp:extent cx="914400" cy="914400"/>
+            <wp:effectExtent l="0" t="0" r="0" b="0"/>
+            <wp:docPr id="1248060868" name="Picture 5" descr="Html Logo"/>
+            <wp:cNvGraphicFramePr>
+              <a:graphicFrameLocks xmlns:a="http://schemas.openxmlformats.org/drawingml/2006/main" noChangeAspect="1"/>
+            </wp:cNvGraphicFramePr>
+            <a:graphic xmlns:a="http://schemas.openxmlformats.org/drawingml/2006/main">
+              <a:graphicData uri="http://schemas.openxmlformats.org/drawingml/2006/picture">
+                <pic:pic xmlns:pic="http://schemas.openxmlformats.org/drawingml/2006/picture">
+                  <pic:nvPicPr>
+                    <pic:cNvPr id="1248060868" name="Picture 5" descr="Html Logo"/>
+                    <pic:cNvPicPr>
+                      <a:picLocks noChangeAspect="1" noChangeArrowheads="1"/>
+                    </pic:cNvPicPr>
+                  </pic:nvPicPr>
+                  <pic:blipFill>
+                    <a:blip r:embed="rId11">
+                      <a:extLst>
+                        <a:ext uri="{28A0092B-C50C-407E-A947-70E740481C1C}">
+                          <a14:useLocalDpi xmlns:a14="http://schemas.microsoft.com/office/drawing/2010/main" val="0"/>
+                        </a:ext>
+                      </a:extLst>
+                    </a:blip>
+                    <a:srcRect/>
+                    <a:stretch>
+                      <a:fillRect/>
+                    </a:stretch>
+                  </pic:blipFill>
+                  <pic:spPr bwMode="auto">
+                    <a:xfrm>
+                      <a:off x="0" y="0"/>
+                      <a:ext cx="914400" cy="914400"/>
+                    </a:xfrm>
+                    <a:prstGeom prst="rect">
+                      <a:avLst/>
+                    </a:prstGeom>
+                    <a:noFill/>
+                    <a:ln>
+                      <a:noFill/>
+                    </a:ln>
+                  </pic:spPr>
+                </pic:pic>
+              </a:graphicData>
+            </a:graphic>
+          </wp:inline>
+        </w:drawing>
+      </w:r>
+    </w:p>
+    <w:p>
+      <w:pPr>
+        <w:pStyle w:val="Caption"/>
+        <w:jc w:val="center"/>
+      </w:pPr>
+      <w:bookmarkStart w:id="23" w:name="_Toc226412937"/>
+      <w:r>
+        <w:t xml:space="preserve">Figure </w:t>
+      </w:r>
+      <w:fldSimple w:instr=" SEQ Figure \* ARABIC ">
+        <w:r>
+          <w:rPr>
+            <w:noProof/>
+          </w:rPr>
+          <w:t>4</w:t>
+        </w:r>
+      </w:fldSimple>
+      <w:r>
+        <w:t>: Logo html</w:t>
+      </w:r>
+      <w:bookmarkEnd w:id="23"/>
+    </w:p>
+    <w:p>
+      <w:pPr>
+        <w:spacing w:line="360" w:lineRule="auto"/>
+        <w:jc w:val="both"/>
+        <w:rPr>
+          <w:rFonts w:ascii="Times New Roman" w:hAnsi="Times New Roman" w:cs="Times New Roman"/>
+          <w:sz w:val="24"/>
+          <w:szCs w:val="24"/>
+        </w:rPr>
+      </w:pPr>
+      <w:proofErr w:type="spellStart"/>
+      <w:r>
+        <w:rPr>
+          <w:rFonts w:ascii="Times New Roman" w:hAnsi="Times New Roman" w:cs="Times New Roman"/>
+          <w:sz w:val="24"/>
+          <w:szCs w:val="24"/>
+        </w:rPr>
+        <w:t>TypeScript</w:t>
+      </w:r>
+      <w:proofErr w:type="spellEnd"/>
+      <w:r>
+        <w:rPr>
+          <w:rFonts w:ascii="Times New Roman" w:hAnsi="Times New Roman" w:cs="Times New Roman"/>
+          <w:sz w:val="24"/>
+          <w:szCs w:val="24"/>
+        </w:rPr>
+        <w:t xml:space="preserve"> est un langage de programmation qui s’appuie sur JavaScript en y ajoutant un système de typage statique, permettant de détecter les erreurs dès la phase de développement et </w:t>
+      </w:r>
+      <w:r>
+        <w:rPr>
+          <w:rFonts w:ascii="Times New Roman" w:hAnsi="Times New Roman" w:cs="Times New Roman"/>
+          <w:sz w:val="24"/>
+          <w:szCs w:val="24"/>
+        </w:rPr>
+        <w:lastRenderedPageBreak/>
+        <w:t xml:space="preserve">d’améliorer la qualité du code. Dans le cadre de ce projet, </w:t>
+      </w:r>
+      <w:proofErr w:type="spellStart"/>
+      <w:r>
+        <w:rPr>
+          <w:rFonts w:ascii="Times New Roman" w:hAnsi="Times New Roman" w:cs="Times New Roman"/>
+          <w:sz w:val="24"/>
+          <w:szCs w:val="24"/>
+        </w:rPr>
+        <w:t>TypeScript</w:t>
+      </w:r>
+      <w:proofErr w:type="spellEnd"/>
+      <w:r>
+        <w:rPr>
+          <w:rFonts w:ascii="Times New Roman" w:hAnsi="Times New Roman" w:cs="Times New Roman"/>
+          <w:sz w:val="24"/>
+          <w:szCs w:val="24"/>
+        </w:rPr>
+        <w:t xml:space="preserve"> a été utilisé en combinaison avec la bibliothèque </w:t>
+      </w:r>
+      <w:proofErr w:type="spellStart"/>
+      <w:r>
+        <w:rPr>
+          <w:rFonts w:ascii="Times New Roman" w:hAnsi="Times New Roman" w:cs="Times New Roman"/>
+          <w:sz w:val="24"/>
+          <w:szCs w:val="24"/>
+        </w:rPr>
+        <w:t>React</w:t>
+      </w:r>
+      <w:proofErr w:type="spellEnd"/>
+      <w:r>
+        <w:rPr>
+          <w:rFonts w:ascii="Times New Roman" w:hAnsi="Times New Roman" w:cs="Times New Roman"/>
+          <w:sz w:val="24"/>
+          <w:szCs w:val="24"/>
+        </w:rPr>
+        <w:t xml:space="preserve"> pour développer l’interface dynamique de l’application web. Cette association a permis de structurer les composants de manière claire, de définir précisément les types des propriétés (</w:t>
+      </w:r>
+      <w:proofErr w:type="spellStart"/>
+      <w:r>
+        <w:rPr>
+          <w:rFonts w:ascii="Times New Roman" w:hAnsi="Times New Roman" w:cs="Times New Roman"/>
+          <w:sz w:val="24"/>
+          <w:szCs w:val="24"/>
+        </w:rPr>
+        <w:t>props</w:t>
+      </w:r>
+      <w:proofErr w:type="spellEnd"/>
+      <w:r>
+        <w:rPr>
+          <w:rFonts w:ascii="Times New Roman" w:hAnsi="Times New Roman" w:cs="Times New Roman"/>
+          <w:sz w:val="24"/>
+          <w:szCs w:val="24"/>
+        </w:rPr>
+        <w:t xml:space="preserve">) et des états (state), et d’assurer une meilleure gestion des données entre les différentes parties de l’application. L’utilisation conjointe de </w:t>
+      </w:r>
+      <w:proofErr w:type="spellStart"/>
+      <w:r>
+        <w:rPr>
+          <w:rFonts w:ascii="Times New Roman" w:hAnsi="Times New Roman" w:cs="Times New Roman"/>
+          <w:sz w:val="24"/>
+          <w:szCs w:val="24"/>
+        </w:rPr>
+        <w:t>TypeScript</w:t>
+      </w:r>
+      <w:proofErr w:type="spellEnd"/>
+      <w:r>
+        <w:rPr>
+          <w:rFonts w:ascii="Times New Roman" w:hAnsi="Times New Roman" w:cs="Times New Roman"/>
+          <w:sz w:val="24"/>
+          <w:szCs w:val="24"/>
+        </w:rPr>
+        <w:t xml:space="preserve"> et </w:t>
+      </w:r>
+      <w:proofErr w:type="spellStart"/>
+      <w:r>
+        <w:rPr>
+          <w:rFonts w:ascii="Times New Roman" w:hAnsi="Times New Roman" w:cs="Times New Roman"/>
+          <w:sz w:val="24"/>
+          <w:szCs w:val="24"/>
+        </w:rPr>
+        <w:t>React</w:t>
+      </w:r>
+      <w:proofErr w:type="spellEnd"/>
+      <w:r>
+        <w:rPr>
+          <w:rFonts w:ascii="Times New Roman" w:hAnsi="Times New Roman" w:cs="Times New Roman"/>
+          <w:sz w:val="24"/>
+          <w:szCs w:val="24"/>
+        </w:rPr>
+        <w:t xml:space="preserve"> a ainsi renforcé la robustesse, la lisibilité et la maintenabilité du code, tout en facilitant l’évolution du projet et en garantissant une expérience utilisateur fluide et performante.</w:t>
+      </w:r>
+    </w:p>
+    <w:p>
+      <w:pPr>
+        <w:keepNext/>
+        <w:jc w:val="center"/>
+      </w:pPr>
+      <w:r>
+        <w:rPr>
+          <w:noProof/>
+        </w:rPr>
+        <w:drawing>
+          <wp:inline distT="0" distB="0" distL="0" distR="0" wp14:anchorId="0EA27ECC" wp14:editId="572362AD">
+            <wp:extent cx="560268" cy="560268"/>
+            <wp:effectExtent l="0" t="0" r="0" b="0"/>
+            <wp:docPr id="765806190" name="Picture 5"/>
+            <wp:cNvGraphicFramePr>
+              <a:graphicFrameLocks xmlns:a="http://schemas.openxmlformats.org/drawingml/2006/main" noChangeAspect="1"/>
+            </wp:cNvGraphicFramePr>
+            <a:graphic xmlns:a="http://schemas.openxmlformats.org/drawingml/2006/main">
+              <a:graphicData uri="http://schemas.openxmlformats.org/drawingml/2006/picture">
+                <pic:pic xmlns:pic="http://schemas.openxmlformats.org/drawingml/2006/picture">
+                  <pic:nvPicPr>
+                    <pic:cNvPr id="765806190" name="Picture 765806190"/>
+                    <pic:cNvPicPr/>
+                  </pic:nvPicPr>
+                  <pic:blipFill>
+                    <a:blip r:embed="rId12" cstate="print">
+                      <a:extLst>
+                        <a:ext uri="{28A0092B-C50C-407E-A947-70E740481C1C}">
+                          <a14:useLocalDpi xmlns:a14="http://schemas.microsoft.com/office/drawing/2010/main" val="0"/>
+                        </a:ext>
+                      </a:extLst>
+                    </a:blip>
+                    <a:stretch>
+                      <a:fillRect/>
+                    </a:stretch>
+                  </pic:blipFill>
+                  <pic:spPr>
+                    <a:xfrm>
+                      <a:off x="0" y="0"/>
+                      <a:ext cx="578747" cy="578747"/>
+                    </a:xfrm>
+                    <a:prstGeom prst="rect">
+                      <a:avLst/>
+                    </a:prstGeom>
+                  </pic:spPr>
+                </pic:pic>
+              </a:graphicData>
+            </a:graphic>
+          </wp:inline>
+        </w:drawing>
+      </w:r>
+    </w:p>
+    <w:p>
+      <w:pPr>
+        <w:pStyle w:val="Caption"/>
+        <w:jc w:val="center"/>
+      </w:pPr>
+      <w:bookmarkStart w:id="24" w:name="_Toc226412938"/>
+      <w:r>
+        <w:t xml:space="preserve">Figure </w:t>
+      </w:r>
+      <w:fldSimple w:instr=" SEQ Figure \* ARABIC ">
+        <w:r>
+          <w:rPr>
+            <w:noProof/>
+          </w:rPr>
+          <w:t>5</w:t>
+        </w:r>
+      </w:fldSimple>
+      <w:r>
+        <w:t xml:space="preserve">: logo </w:t>
+      </w:r>
+      <w:proofErr w:type="spellStart"/>
+      <w:r>
+        <w:t>Typescript</w:t>
+      </w:r>
+      <w:bookmarkEnd w:id="24"/>
+      <w:proofErr w:type="spellEnd"/>
     </w:p>
     <w:p>
       <w:pPr>
@@ -12913,7 +13365,7 @@
                     </pic:cNvPicPr>
                   </pic:nvPicPr>
                   <pic:blipFill>
-                    <a:blip r:embed="rId11">
+                    <a:blip r:embed="rId13">
                       <a:extLst>
                         <a:ext uri="{28A0092B-C50C-407E-A947-70E740481C1C}">
                           <a14:useLocalDpi xmlns:a14="http://schemas.microsoft.com/office/drawing/2010/main" val="0"/>
@@ -12955,7 +13407,7 @@
           <w:szCs w:val="24"/>
         </w:rPr>
       </w:pPr>
-      <w:bookmarkStart w:id="23" w:name="_Toc226240791"/>
+      <w:bookmarkStart w:id="25" w:name="_Toc226412939"/>
       <w:r>
         <w:rPr>
           <w:rFonts w:asciiTheme="majorBidi" w:hAnsiTheme="majorBidi" w:cstheme="majorBidi"/>
@@ -12985,7 +13437,7 @@
           <w:rFonts w:asciiTheme="majorBidi" w:hAnsiTheme="majorBidi" w:cstheme="majorBidi"/>
           <w:noProof/>
         </w:rPr>
-        <w:t>4</w:t>
+        <w:t>6</w:t>
       </w:r>
       <w:r>
         <w:rPr>
@@ -13000,7 +13452,7 @@
         </w:rPr>
         <w:t>: Logo de Flask</w:t>
       </w:r>
-      <w:bookmarkEnd w:id="23"/>
+      <w:bookmarkEnd w:id="25"/>
     </w:p>
     <w:p>
       <w:pPr>
@@ -13067,7 +13519,7 @@
                     <pic:cNvPicPr/>
                   </pic:nvPicPr>
                   <pic:blipFill>
-                    <a:blip r:embed="rId12">
+                    <a:blip r:embed="rId14">
                       <a:extLst>
                         <a:ext uri="{28A0092B-C50C-407E-A947-70E740481C1C}">
                           <a14:useLocalDpi xmlns:a14="http://schemas.microsoft.com/office/drawing/2010/main" val="0"/>
@@ -13102,7 +13554,7 @@
           <w:rFonts w:asciiTheme="majorBidi" w:hAnsiTheme="majorBidi" w:cstheme="majorBidi"/>
         </w:rPr>
       </w:pPr>
-      <w:bookmarkStart w:id="24" w:name="_Toc226240792"/>
+      <w:bookmarkStart w:id="26" w:name="_Toc226412940"/>
       <w:r>
         <w:rPr>
           <w:rFonts w:asciiTheme="majorBidi" w:hAnsiTheme="majorBidi" w:cstheme="majorBidi"/>
@@ -13132,7 +13584,7 @@
           <w:rFonts w:asciiTheme="majorBidi" w:hAnsiTheme="majorBidi" w:cstheme="majorBidi"/>
           <w:noProof/>
         </w:rPr>
-        <w:t>5</w:t>
+        <w:t>7</w:t>
       </w:r>
       <w:r>
         <w:rPr>
@@ -13147,7 +13599,7 @@
         </w:rPr>
         <w:t>: Logo de PostgreSQL</w:t>
       </w:r>
-      <w:bookmarkEnd w:id="24"/>
+      <w:bookmarkEnd w:id="26"/>
     </w:p>
     <w:p>
       <w:pPr>
@@ -13160,15 +13612,14 @@
           <w:rFonts w:asciiTheme="majorBidi" w:hAnsiTheme="majorBidi"/>
         </w:rPr>
       </w:pPr>
-      <w:bookmarkStart w:id="25" w:name="_Toc226240763"/>
+      <w:bookmarkStart w:id="27" w:name="_Toc226412984"/>
       <w:r>
         <w:rPr>
           <w:rFonts w:asciiTheme="majorBidi" w:hAnsiTheme="majorBidi"/>
         </w:rPr>
-        <w:lastRenderedPageBreak/>
         <w:t>Outils de design et UI/UX :</w:t>
       </w:r>
-      <w:bookmarkEnd w:id="25"/>
+      <w:bookmarkEnd w:id="27"/>
     </w:p>
     <w:p>
       <w:pPr>
@@ -13202,7 +13653,16 @@
           <w:sz w:val="24"/>
           <w:szCs w:val="24"/>
         </w:rPr>
-        <w:t xml:space="preserve"> de l’interface utilisateur et de l’identité visuelle constitue une étape essentielle dans le développement de la plateforme. Elle permet d’assurer une expérience utilisateur agréable, intuitive et cohérente avec l’image de la plateforme. Dans le cadre de ce projet, plusieurs outils de design ont été utilisés afin de concevoir les maquettes, créer les éléments graphiques et développer une identité visuelle professionnelle.</w:t>
+        <w:t xml:space="preserve"> de l’interface utilisateur et de l’identité visuelle constitue une étape essentielle dans le développement de la plateforme. Elle permet d’assurer une expérience utilisateur agréable, intuitive et cohérente avec l’image de la plateforme. Dans le cadre de ce projet, plusieurs outils </w:t>
+      </w:r>
+      <w:r>
+        <w:rPr>
+          <w:rFonts w:asciiTheme="majorBidi" w:hAnsiTheme="majorBidi" w:cstheme="majorBidi"/>
+          <w:sz w:val="24"/>
+          <w:szCs w:val="24"/>
+        </w:rPr>
+        <w:lastRenderedPageBreak/>
+        <w:t>de design ont été utilisés afin de concevoir les maquettes, créer les éléments graphiques et développer une identité visuelle professionnelle.</w:t>
       </w:r>
     </w:p>
     <w:p>
@@ -13273,10 +13733,10 @@
                     </pic:cNvPicPr>
                   </pic:nvPicPr>
                   <pic:blipFill>
-                    <a:blip r:embed="rId13">
+                    <a:blip r:embed="rId15">
                       <a:extLst>
                         <a:ext uri="{96DAC541-7B7A-43D3-8B79-37D633B846F1}">
-                          <asvg:svgBlip xmlns:asvg="http://schemas.microsoft.com/office/drawing/2016/SVG/main" r:embed="rId14"/>
+                          <asvg:svgBlip xmlns:asvg="http://schemas.microsoft.com/office/drawing/2016/SVG/main" r:embed="rId16"/>
                         </a:ext>
                       </a:extLst>
                     </a:blip>
@@ -13310,7 +13770,7 @@
           <w:szCs w:val="24"/>
         </w:rPr>
       </w:pPr>
-      <w:bookmarkStart w:id="26" w:name="_Toc226240793"/>
+      <w:bookmarkStart w:id="28" w:name="_Toc226412941"/>
       <w:r>
         <w:rPr>
           <w:rFonts w:asciiTheme="majorBidi" w:hAnsiTheme="majorBidi" w:cstheme="majorBidi"/>
@@ -13340,7 +13800,7 @@
           <w:rFonts w:asciiTheme="majorBidi" w:hAnsiTheme="majorBidi" w:cstheme="majorBidi"/>
           <w:noProof/>
         </w:rPr>
-        <w:t>6</w:t>
+        <w:t>8</w:t>
       </w:r>
       <w:r>
         <w:rPr>
@@ -13355,7 +13815,7 @@
         </w:rPr>
         <w:t>: Logo de Figma</w:t>
       </w:r>
-      <w:bookmarkEnd w:id="26"/>
+      <w:bookmarkEnd w:id="28"/>
     </w:p>
     <w:p>
       <w:pPr>
@@ -13418,7 +13878,7 @@
                     </pic:cNvPicPr>
                   </pic:nvPicPr>
                   <pic:blipFill>
-                    <a:blip r:embed="rId15">
+                    <a:blip r:embed="rId17">
                       <a:extLst>
                         <a:ext uri="{28A0092B-C50C-407E-A947-70E740481C1C}">
                           <a14:useLocalDpi xmlns:a14="http://schemas.microsoft.com/office/drawing/2010/main" val="0"/>
@@ -13463,7 +13923,7 @@
           <w14:ligatures w14:val="none"/>
         </w:rPr>
       </w:pPr>
-      <w:bookmarkStart w:id="27" w:name="_Toc226240794"/>
+      <w:bookmarkStart w:id="29" w:name="_Toc226412942"/>
       <w:r>
         <w:rPr>
           <w:rFonts w:asciiTheme="majorBidi" w:hAnsiTheme="majorBidi" w:cstheme="majorBidi"/>
@@ -13493,7 +13953,7 @@
           <w:rFonts w:asciiTheme="majorBidi" w:hAnsiTheme="majorBidi" w:cstheme="majorBidi"/>
           <w:noProof/>
         </w:rPr>
-        <w:t>7</w:t>
+        <w:t>9</w:t>
       </w:r>
       <w:r>
         <w:rPr>
@@ -13508,7 +13968,7 @@
         </w:rPr>
         <w:t>: Logo de Photoshop</w:t>
       </w:r>
-      <w:bookmarkEnd w:id="27"/>
+      <w:bookmarkEnd w:id="29"/>
     </w:p>
     <w:p>
       <w:pPr>
@@ -13569,7 +14029,7 @@
                     <pic:cNvPicPr/>
                   </pic:nvPicPr>
                   <pic:blipFill>
-                    <a:blip r:embed="rId16" cstate="print">
+                    <a:blip r:embed="rId18" cstate="print">
                       <a:extLst>
                         <a:ext uri="{28A0092B-C50C-407E-A947-70E740481C1C}">
                           <a14:useLocalDpi xmlns:a14="http://schemas.microsoft.com/office/drawing/2010/main" val="0"/>
@@ -13604,7 +14064,7 @@
           <w:rFonts w:asciiTheme="majorBidi" w:hAnsiTheme="majorBidi" w:cstheme="majorBidi"/>
         </w:rPr>
       </w:pPr>
-      <w:bookmarkStart w:id="28" w:name="_Toc226240795"/>
+      <w:bookmarkStart w:id="30" w:name="_Toc226412943"/>
       <w:r>
         <w:rPr>
           <w:rFonts w:asciiTheme="majorBidi" w:hAnsiTheme="majorBidi" w:cstheme="majorBidi"/>
@@ -13634,7 +14094,7 @@
           <w:rFonts w:asciiTheme="majorBidi" w:hAnsiTheme="majorBidi" w:cstheme="majorBidi"/>
           <w:noProof/>
         </w:rPr>
-        <w:t>8</w:t>
+        <w:t>10</w:t>
       </w:r>
       <w:r>
         <w:rPr>
@@ -13649,7 +14109,7 @@
         </w:rPr>
         <w:t>: Logo de illustrator</w:t>
       </w:r>
-      <w:bookmarkEnd w:id="28"/>
+      <w:bookmarkEnd w:id="30"/>
     </w:p>
     <w:p>
       <w:pPr>
@@ -13678,7 +14138,6 @@
           <w:sz w:val="24"/>
           <w:szCs w:val="24"/>
         </w:rPr>
-        <w:lastRenderedPageBreak/>
         <w:t xml:space="preserve">Voici le logo du site web réalisé par adobe illustrator : </w:t>
       </w:r>
     </w:p>
@@ -13695,6 +14154,7 @@
           <w:rFonts w:asciiTheme="majorBidi" w:hAnsiTheme="majorBidi" w:cstheme="majorBidi"/>
           <w:noProof/>
         </w:rPr>
+        <w:lastRenderedPageBreak/>
         <w:drawing>
           <wp:inline distT="0" distB="0" distL="0" distR="0" wp14:anchorId="4491D6D9" wp14:editId="00EAB361">
             <wp:extent cx="3119377" cy="1049420"/>
@@ -13711,7 +14171,7 @@
                     <pic:cNvPicPr/>
                   </pic:nvPicPr>
                   <pic:blipFill>
-                    <a:blip r:embed="rId17" cstate="print">
+                    <a:blip r:embed="rId19" cstate="print">
                       <a:extLst>
                         <a:ext uri="{28A0092B-C50C-407E-A947-70E740481C1C}">
                           <a14:useLocalDpi xmlns:a14="http://schemas.microsoft.com/office/drawing/2010/main" val="0"/>
@@ -13746,7 +14206,7 @@
           <w:rFonts w:asciiTheme="majorBidi" w:hAnsiTheme="majorBidi" w:cstheme="majorBidi"/>
         </w:rPr>
       </w:pPr>
-      <w:bookmarkStart w:id="29" w:name="_Toc226240796"/>
+      <w:bookmarkStart w:id="31" w:name="_Toc226412944"/>
       <w:r>
         <w:rPr>
           <w:rFonts w:asciiTheme="majorBidi" w:hAnsiTheme="majorBidi" w:cstheme="majorBidi"/>
@@ -13776,7 +14236,7 @@
           <w:rFonts w:asciiTheme="majorBidi" w:hAnsiTheme="majorBidi" w:cstheme="majorBidi"/>
           <w:noProof/>
         </w:rPr>
-        <w:t>9</w:t>
+        <w:t>11</w:t>
       </w:r>
       <w:r>
         <w:rPr>
@@ -13813,7 +14273,7 @@
         </w:rPr>
         <w:t xml:space="preserve"> site web</w:t>
       </w:r>
-      <w:bookmarkEnd w:id="29"/>
+      <w:bookmarkEnd w:id="31"/>
     </w:p>
     <w:p>
       <w:pPr>
@@ -14000,7 +14460,7 @@
                     <pic:cNvPicPr/>
                   </pic:nvPicPr>
                   <pic:blipFill>
-                    <a:blip r:embed="rId18">
+                    <a:blip r:embed="rId20">
                       <a:extLst>
                         <a:ext uri="{28A0092B-C50C-407E-A947-70E740481C1C}">
                           <a14:useLocalDpi xmlns:a14="http://schemas.microsoft.com/office/drawing/2010/main" val="0"/>
@@ -14032,7 +14492,7 @@
         <w:pStyle w:val="Caption"/>
         <w:jc w:val="center"/>
       </w:pPr>
-      <w:bookmarkStart w:id="30" w:name="_Toc226240797"/>
+      <w:bookmarkStart w:id="32" w:name="_Toc226412945"/>
       <w:r>
         <w:t xml:space="preserve">Figure </w:t>
       </w:r>
@@ -14041,13 +14501,13 @@
           <w:rPr>
             <w:noProof/>
           </w:rPr>
-          <w:t>10</w:t>
+          <w:t>12</w:t>
         </w:r>
       </w:fldSimple>
       <w:r>
         <w:t>: La typographie</w:t>
       </w:r>
-      <w:bookmarkEnd w:id="30"/>
+      <w:bookmarkEnd w:id="32"/>
     </w:p>
     <w:p>
       <w:pPr>
@@ -14158,7 +14618,7 @@
                     <pic:cNvPicPr/>
                   </pic:nvPicPr>
                   <pic:blipFill>
-                    <a:blip r:embed="rId19">
+                    <a:blip r:embed="rId21">
                       <a:extLst>
                         <a:ext uri="{28A0092B-C50C-407E-A947-70E740481C1C}">
                           <a14:useLocalDpi xmlns:a14="http://schemas.microsoft.com/office/drawing/2010/main" val="0"/>
@@ -14190,7 +14650,7 @@
         <w:pStyle w:val="Caption"/>
         <w:jc w:val="center"/>
       </w:pPr>
-      <w:bookmarkStart w:id="31" w:name="_Toc226240798"/>
+      <w:bookmarkStart w:id="33" w:name="_Toc226412946"/>
       <w:r>
         <w:t xml:space="preserve">Figure </w:t>
       </w:r>
@@ -14199,13 +14659,13 @@
           <w:rPr>
             <w:noProof/>
           </w:rPr>
-          <w:t>11</w:t>
+          <w:t>13</w:t>
         </w:r>
       </w:fldSimple>
       <w:r>
         <w:t>: la palette de couleurs</w:t>
       </w:r>
-      <w:bookmarkEnd w:id="31"/>
+      <w:bookmarkEnd w:id="33"/>
     </w:p>
     <w:p>
       <w:pPr>
@@ -14295,7 +14755,7 @@
                     <pic:cNvPicPr/>
                   </pic:nvPicPr>
                   <pic:blipFill>
-                    <a:blip r:embed="rId20" cstate="print">
+                    <a:blip r:embed="rId22" cstate="print">
                       <a:extLst>
                         <a:ext uri="{28A0092B-C50C-407E-A947-70E740481C1C}">
                           <a14:useLocalDpi xmlns:a14="http://schemas.microsoft.com/office/drawing/2010/main" val="0"/>
@@ -14330,7 +14790,7 @@
           <w:lang w:eastAsia="fr-FR"/>
         </w:rPr>
       </w:pPr>
-      <w:bookmarkStart w:id="32" w:name="_Toc226240799"/>
+      <w:bookmarkStart w:id="34" w:name="_Toc226412947"/>
       <w:r>
         <w:t xml:space="preserve">Figure </w:t>
       </w:r>
@@ -14339,13 +14799,13 @@
           <w:rPr>
             <w:noProof/>
           </w:rPr>
-          <w:t>12</w:t>
+          <w:t>14</w:t>
         </w:r>
       </w:fldSimple>
       <w:r>
         <w:t>: l'explication du logo</w:t>
       </w:r>
-      <w:bookmarkEnd w:id="32"/>
+      <w:bookmarkEnd w:id="34"/>
     </w:p>
     <w:p>
       <w:pPr>
@@ -14359,7 +14819,7 @@
           <w:lang w:eastAsia="fr-FR"/>
         </w:rPr>
       </w:pPr>
-      <w:bookmarkStart w:id="33" w:name="_Toc226240764"/>
+      <w:bookmarkStart w:id="35" w:name="_Toc226412985"/>
       <w:r>
         <w:rPr>
           <w:rFonts w:ascii="Times New Roman" w:eastAsia="Times New Roman" w:hAnsi="Times New Roman" w:cs="Times New Roman"/>
@@ -14367,7 +14827,7 @@
         </w:rPr>
         <w:t>Outils de marketing digital</w:t>
       </w:r>
-      <w:bookmarkEnd w:id="33"/>
+      <w:bookmarkEnd w:id="35"/>
     </w:p>
     <w:p>
       <w:pPr>
@@ -14473,7 +14933,7 @@
                     <pic:cNvPicPr/>
                   </pic:nvPicPr>
                   <pic:blipFill>
-                    <a:blip r:embed="rId21">
+                    <a:blip r:embed="rId23">
                       <a:extLst>
                         <a:ext uri="{28A0092B-C50C-407E-A947-70E740481C1C}">
                           <a14:useLocalDpi xmlns:a14="http://schemas.microsoft.com/office/drawing/2010/main" val="0"/>
@@ -14510,7 +14970,7 @@
           <w:lang w:eastAsia="fr-FR"/>
         </w:rPr>
       </w:pPr>
-      <w:bookmarkStart w:id="34" w:name="_Toc226240800"/>
+      <w:bookmarkStart w:id="36" w:name="_Toc226412948"/>
       <w:r>
         <w:t xml:space="preserve">Figure </w:t>
       </w:r>
@@ -14519,13 +14979,13 @@
           <w:rPr>
             <w:noProof/>
           </w:rPr>
-          <w:t>13</w:t>
+          <w:t>15</w:t>
         </w:r>
       </w:fldSimple>
       <w:r>
         <w:t>: Google Analytics</w:t>
       </w:r>
-      <w:bookmarkEnd w:id="34"/>
+      <w:bookmarkEnd w:id="36"/>
     </w:p>
     <w:p>
       <w:pPr>
@@ -14608,7 +15068,7 @@
                     <pic:cNvPicPr/>
                   </pic:nvPicPr>
                   <pic:blipFill>
-                    <a:blip r:embed="rId22">
+                    <a:blip r:embed="rId24">
                       <a:extLst>
                         <a:ext uri="{28A0092B-C50C-407E-A947-70E740481C1C}">
                           <a14:useLocalDpi xmlns:a14="http://schemas.microsoft.com/office/drawing/2010/main" val="0"/>
@@ -14645,7 +15105,7 @@
           <w:lang w:eastAsia="fr-FR"/>
         </w:rPr>
       </w:pPr>
-      <w:bookmarkStart w:id="35" w:name="_Toc226240801"/>
+      <w:bookmarkStart w:id="37" w:name="_Toc226412949"/>
       <w:r>
         <w:t xml:space="preserve">Figure </w:t>
       </w:r>
@@ -14654,7 +15114,7 @@
           <w:rPr>
             <w:noProof/>
           </w:rPr>
-          <w:t>14</w:t>
+          <w:t>16</w:t>
         </w:r>
       </w:fldSimple>
       <w:r>
@@ -14664,7 +15124,7 @@
       <w:r>
         <w:t>Ahrefs</w:t>
       </w:r>
-      <w:bookmarkEnd w:id="35"/>
+      <w:bookmarkEnd w:id="37"/>
       <w:proofErr w:type="spellEnd"/>
     </w:p>
     <w:p>
@@ -14767,7 +15227,7 @@
                     <pic:cNvPicPr/>
                   </pic:nvPicPr>
                   <pic:blipFill>
-                    <a:blip r:embed="rId23" cstate="print">
+                    <a:blip r:embed="rId25" cstate="print">
                       <a:extLst>
                         <a:ext uri="{28A0092B-C50C-407E-A947-70E740481C1C}">
                           <a14:useLocalDpi xmlns:a14="http://schemas.microsoft.com/office/drawing/2010/main" val="0"/>
@@ -14804,7 +15264,7 @@
           <w:lang w:eastAsia="fr-FR"/>
         </w:rPr>
       </w:pPr>
-      <w:bookmarkStart w:id="36" w:name="_Toc226240802"/>
+      <w:bookmarkStart w:id="38" w:name="_Toc226412950"/>
       <w:r>
         <w:t xml:space="preserve">Figure </w:t>
       </w:r>
@@ -14813,13 +15273,13 @@
           <w:rPr>
             <w:noProof/>
           </w:rPr>
-          <w:t>15</w:t>
+          <w:t>17</w:t>
         </w:r>
       </w:fldSimple>
       <w:r>
         <w:t>: Chatgpt</w:t>
       </w:r>
-      <w:bookmarkEnd w:id="36"/>
+      <w:bookmarkEnd w:id="38"/>
     </w:p>
     <w:p>
       <w:pPr>
@@ -14884,7 +15344,7 @@
           <w:lang w:eastAsia="fr-FR"/>
         </w:rPr>
       </w:pPr>
-      <w:bookmarkStart w:id="37" w:name="_Toc226240765"/>
+      <w:bookmarkStart w:id="39" w:name="_Toc226412986"/>
       <w:r>
         <w:rPr>
           <w:lang w:eastAsia="fr-FR"/>
@@ -14897,7 +15357,7 @@
         </w:rPr>
         <w:t> :</w:t>
       </w:r>
-      <w:bookmarkEnd w:id="37"/>
+      <w:bookmarkEnd w:id="39"/>
     </w:p>
     <w:p>
       <w:pPr>
@@ -14994,7 +15454,7 @@
                     </pic:cNvPicPr>
                   </pic:nvPicPr>
                   <pic:blipFill>
-                    <a:blip r:embed="rId24" cstate="print">
+                    <a:blip r:embed="rId26" cstate="print">
                       <a:extLst>
                         <a:ext uri="{28A0092B-C50C-407E-A947-70E740481C1C}">
                           <a14:useLocalDpi xmlns:a14="http://schemas.microsoft.com/office/drawing/2010/main" val="0"/>
@@ -15026,7 +15486,7 @@
         <w:pStyle w:val="Caption"/>
         <w:jc w:val="center"/>
       </w:pPr>
-      <w:bookmarkStart w:id="38" w:name="_Toc226240803"/>
+      <w:bookmarkStart w:id="40" w:name="_Toc226412951"/>
       <w:r>
         <w:t xml:space="preserve">Figure </w:t>
       </w:r>
@@ -15035,13 +15495,13 @@
           <w:rPr>
             <w:noProof/>
           </w:rPr>
-          <w:t>16</w:t>
+          <w:t>18</w:t>
         </w:r>
       </w:fldSimple>
       <w:r>
         <w:t>: Logo de VS Code</w:t>
       </w:r>
-      <w:bookmarkEnd w:id="38"/>
+      <w:bookmarkEnd w:id="40"/>
     </w:p>
     <w:p>
       <w:pPr>
@@ -15090,10 +15550,10 @@
                     </pic:cNvPicPr>
                   </pic:nvPicPr>
                   <pic:blipFill>
-                    <a:blip r:embed="rId25">
+                    <a:blip r:embed="rId27">
                       <a:extLst>
                         <a:ext uri="{96DAC541-7B7A-43D3-8B79-37D633B846F1}">
-                          <asvg:svgBlip xmlns:asvg="http://schemas.microsoft.com/office/drawing/2016/SVG/main" r:embed="rId26"/>
+                          <asvg:svgBlip xmlns:asvg="http://schemas.microsoft.com/office/drawing/2016/SVG/main" r:embed="rId28"/>
                         </a:ext>
                       </a:extLst>
                     </a:blip>
@@ -15122,7 +15582,7 @@
         <w:pStyle w:val="Caption"/>
         <w:jc w:val="center"/>
       </w:pPr>
-      <w:bookmarkStart w:id="39" w:name="_Toc226240804"/>
+      <w:bookmarkStart w:id="41" w:name="_Toc226412952"/>
       <w:r>
         <w:t xml:space="preserve">Figure </w:t>
       </w:r>
@@ -15131,13 +15591,13 @@
           <w:rPr>
             <w:noProof/>
           </w:rPr>
-          <w:t>17</w:t>
+          <w:t>19</w:t>
         </w:r>
       </w:fldSimple>
       <w:r>
         <w:t>: Logo de git</w:t>
       </w:r>
-      <w:bookmarkEnd w:id="39"/>
+      <w:bookmarkEnd w:id="41"/>
     </w:p>
     <w:p>
       <w:pPr>
@@ -15193,7 +15653,7 @@
                     </pic:cNvPicPr>
                   </pic:nvPicPr>
                   <pic:blipFill>
-                    <a:blip r:embed="rId27" cstate="print">
+                    <a:blip r:embed="rId29" cstate="print">
                       <a:extLst>
                         <a:ext uri="{28A0092B-C50C-407E-A947-70E740481C1C}">
                           <a14:useLocalDpi xmlns:a14="http://schemas.microsoft.com/office/drawing/2010/main" val="0"/>
@@ -15228,7 +15688,7 @@
           <w:lang w:eastAsia="fr-FR"/>
         </w:rPr>
       </w:pPr>
-      <w:bookmarkStart w:id="40" w:name="_Toc226240805"/>
+      <w:bookmarkStart w:id="42" w:name="_Toc226412953"/>
       <w:r>
         <w:t xml:space="preserve">Figure </w:t>
       </w:r>
@@ -15237,13 +15697,13 @@
           <w:rPr>
             <w:noProof/>
           </w:rPr>
-          <w:t>18</w:t>
+          <w:t>20</w:t>
         </w:r>
       </w:fldSimple>
       <w:r>
         <w:t>: Logo de GitHub</w:t>
       </w:r>
-      <w:bookmarkEnd w:id="40"/>
+      <w:bookmarkEnd w:id="42"/>
     </w:p>
     <w:p>
       <w:pPr>
@@ -15257,7 +15717,7 @@
           <w:u w:val="single"/>
         </w:rPr>
       </w:pPr>
-      <w:bookmarkStart w:id="41" w:name="_Toc226240766"/>
+      <w:bookmarkStart w:id="43" w:name="_Toc226412987"/>
       <w:r>
         <w:rPr>
           <w:rFonts w:asciiTheme="majorBidi" w:hAnsiTheme="majorBidi"/>
@@ -15265,7 +15725,7 @@
         </w:rPr>
         <w:t>Modélisation UML</w:t>
       </w:r>
-      <w:bookmarkEnd w:id="41"/>
+      <w:bookmarkEnd w:id="43"/>
     </w:p>
     <w:p>
       <w:pPr>
@@ -15297,14 +15757,14 @@
           <w:rFonts w:asciiTheme="majorBidi" w:hAnsiTheme="majorBidi"/>
         </w:rPr>
       </w:pPr>
-      <w:bookmarkStart w:id="42" w:name="_Toc226240767"/>
+      <w:bookmarkStart w:id="44" w:name="_Toc226412988"/>
       <w:r>
         <w:rPr>
           <w:rFonts w:asciiTheme="majorBidi" w:hAnsiTheme="majorBidi"/>
         </w:rPr>
         <w:t>Diagramme de Classes</w:t>
       </w:r>
-      <w:bookmarkEnd w:id="42"/>
+      <w:bookmarkEnd w:id="44"/>
     </w:p>
     <w:p>
       <w:pPr>
@@ -15796,7 +16256,7 @@
                     <pic:cNvPicPr/>
                   </pic:nvPicPr>
                   <pic:blipFill>
-                    <a:blip r:embed="rId28">
+                    <a:blip r:embed="rId30">
                       <a:extLst>
                         <a:ext uri="{28A0092B-C50C-407E-A947-70E740481C1C}">
                           <a14:useLocalDpi xmlns:a14="http://schemas.microsoft.com/office/drawing/2010/main" val="0"/>
@@ -15833,7 +16293,7 @@
           <w:szCs w:val="24"/>
         </w:rPr>
       </w:pPr>
-      <w:bookmarkStart w:id="43" w:name="_Toc226240806"/>
+      <w:bookmarkStart w:id="45" w:name="_Toc226412954"/>
       <w:r>
         <w:t xml:space="preserve">Figure </w:t>
       </w:r>
@@ -15842,13 +16302,13 @@
           <w:rPr>
             <w:noProof/>
           </w:rPr>
-          <w:t>19</w:t>
+          <w:t>21</w:t>
         </w:r>
       </w:fldSimple>
       <w:r>
         <w:t>: Diagramme de classes</w:t>
       </w:r>
-      <w:bookmarkEnd w:id="43"/>
+      <w:bookmarkEnd w:id="45"/>
     </w:p>
     <w:p>
       <w:pPr>
@@ -15861,14 +16321,14 @@
           <w:rFonts w:asciiTheme="majorBidi" w:hAnsiTheme="majorBidi"/>
         </w:rPr>
       </w:pPr>
-      <w:bookmarkStart w:id="44" w:name="_Toc226240768"/>
+      <w:bookmarkStart w:id="46" w:name="_Toc226412989"/>
       <w:r>
         <w:rPr>
           <w:rFonts w:asciiTheme="majorBidi" w:hAnsiTheme="majorBidi"/>
         </w:rPr>
         <w:t>Diagramme de Séquence (Scénario : Location d'une voiture)</w:t>
       </w:r>
-      <w:bookmarkEnd w:id="44"/>
+      <w:bookmarkEnd w:id="46"/>
     </w:p>
     <w:p>
       <w:pPr>
@@ -16261,14 +16721,14 @@
           <w:rFonts w:asciiTheme="majorBidi" w:hAnsiTheme="majorBidi"/>
         </w:rPr>
       </w:pPr>
-      <w:bookmarkStart w:id="45" w:name="_Toc226240769"/>
+      <w:bookmarkStart w:id="47" w:name="_Toc226412990"/>
       <w:r>
         <w:rPr>
           <w:rFonts w:asciiTheme="majorBidi" w:hAnsiTheme="majorBidi"/>
         </w:rPr>
         <w:t>Conception de la base de données</w:t>
       </w:r>
-      <w:bookmarkEnd w:id="45"/>
+      <w:bookmarkEnd w:id="47"/>
     </w:p>
     <w:p>
       <w:pPr>
@@ -19472,7 +19932,7 @@
           <w:szCs w:val="32"/>
         </w:rPr>
       </w:pPr>
-      <w:bookmarkStart w:id="46" w:name="_Toc226240770"/>
+      <w:bookmarkStart w:id="48" w:name="_Toc226412991"/>
       <w:r>
         <w:rPr>
           <w:rFonts w:ascii="Times New Roman" w:hAnsi="Times New Roman" w:cs="Times New Roman"/>
@@ -19484,7 +19944,7 @@
         <w:lastRenderedPageBreak/>
         <w:t>Chapitre 4 : Réalisation et Mise en œuvre</w:t>
       </w:r>
-      <w:bookmarkEnd w:id="46"/>
+      <w:bookmarkEnd w:id="48"/>
     </w:p>
     <w:p>
       <w:pPr>
@@ -19501,7 +19961,7 @@
           <w:u w:val="single"/>
         </w:rPr>
       </w:pPr>
-      <w:bookmarkStart w:id="47" w:name="_Toc226240771"/>
+      <w:bookmarkStart w:id="49" w:name="_Toc226412992"/>
       <w:r>
         <w:rPr>
           <w:rFonts w:ascii="Times New Roman" w:hAnsi="Times New Roman" w:cs="Times New Roman"/>
@@ -19511,7 +19971,7 @@
         </w:rPr>
         <w:t>Architecture du projet :</w:t>
       </w:r>
-      <w:bookmarkEnd w:id="47"/>
+      <w:bookmarkEnd w:id="49"/>
     </w:p>
     <w:p>
       <w:pPr>
@@ -19544,14 +20004,14 @@
           <w:rFonts w:ascii="Times New Roman" w:hAnsi="Times New Roman" w:cs="Times New Roman"/>
         </w:rPr>
       </w:pPr>
-      <w:bookmarkStart w:id="48" w:name="_Toc226240772"/>
+      <w:bookmarkStart w:id="50" w:name="_Toc226412993"/>
       <w:r>
         <w:rPr>
           <w:rFonts w:ascii="Times New Roman" w:hAnsi="Times New Roman" w:cs="Times New Roman"/>
         </w:rPr>
         <w:t>Arborescence des fichiers :</w:t>
       </w:r>
-      <w:bookmarkEnd w:id="48"/>
+      <w:bookmarkEnd w:id="50"/>
     </w:p>
     <w:p>
       <w:pPr>
@@ -20268,14 +20728,14 @@
           <w:lang w:val="en-US"/>
         </w:rPr>
       </w:pPr>
-      <w:bookmarkStart w:id="49" w:name="_Toc226240773"/>
+      <w:bookmarkStart w:id="51" w:name="_Toc226412994"/>
       <w:r>
         <w:rPr>
           <w:rFonts w:ascii="Times New Roman" w:hAnsi="Times New Roman" w:cs="Times New Roman"/>
         </w:rPr>
         <w:t>Description des dossiers clés :</w:t>
       </w:r>
-      <w:bookmarkEnd w:id="49"/>
+      <w:bookmarkEnd w:id="51"/>
     </w:p>
     <w:p>
       <w:pPr>
@@ -20619,7 +21079,7 @@
           <w:u w:val="single"/>
         </w:rPr>
       </w:pPr>
-      <w:bookmarkStart w:id="50" w:name="_Toc226240774"/>
+      <w:bookmarkStart w:id="52" w:name="_Toc226412995"/>
       <w:r>
         <w:rPr>
           <w:rFonts w:ascii="Times New Roman" w:hAnsi="Times New Roman" w:cs="Times New Roman"/>
@@ -20627,7 +21087,7 @@
         </w:rPr>
         <w:t>Développement du Backend</w:t>
       </w:r>
-      <w:bookmarkEnd w:id="50"/>
+      <w:bookmarkEnd w:id="52"/>
     </w:p>
     <w:p>
       <w:pPr>
@@ -20714,14 +21174,14 @@
           <w:rFonts w:ascii="Times New Roman" w:hAnsi="Times New Roman" w:cs="Times New Roman"/>
         </w:rPr>
       </w:pPr>
-      <w:bookmarkStart w:id="51" w:name="_Toc226240775"/>
+      <w:bookmarkStart w:id="53" w:name="_Toc226412996"/>
       <w:r>
         <w:rPr>
           <w:rFonts w:ascii="Times New Roman" w:hAnsi="Times New Roman" w:cs="Times New Roman"/>
         </w:rPr>
         <w:t>Architecture de l'API</w:t>
       </w:r>
-      <w:bookmarkEnd w:id="51"/>
+      <w:bookmarkEnd w:id="53"/>
     </w:p>
     <w:p>
       <w:pPr>
@@ -20927,14 +21387,14 @@
           <w:rFonts w:ascii="Times New Roman" w:hAnsi="Times New Roman" w:cs="Times New Roman"/>
         </w:rPr>
       </w:pPr>
-      <w:bookmarkStart w:id="52" w:name="_Toc226240776"/>
+      <w:bookmarkStart w:id="54" w:name="_Toc226412997"/>
       <w:r>
         <w:rPr>
           <w:rFonts w:ascii="Times New Roman" w:hAnsi="Times New Roman" w:cs="Times New Roman"/>
         </w:rPr>
         <w:t>Connexion à la base de données (PostgreSQL)</w:t>
       </w:r>
-      <w:bookmarkEnd w:id="52"/>
+      <w:bookmarkEnd w:id="54"/>
     </w:p>
     <w:p>
       <w:pPr>
@@ -21226,14 +21686,14 @@
           <w:rFonts w:ascii="Times New Roman" w:hAnsi="Times New Roman" w:cs="Times New Roman"/>
         </w:rPr>
       </w:pPr>
-      <w:bookmarkStart w:id="53" w:name="_Toc226240777"/>
+      <w:bookmarkStart w:id="55" w:name="_Toc226412998"/>
       <w:r>
         <w:rPr>
           <w:rFonts w:ascii="Times New Roman" w:hAnsi="Times New Roman" w:cs="Times New Roman"/>
         </w:rPr>
         <w:t>Sécurité et Validation</w:t>
       </w:r>
-      <w:bookmarkEnd w:id="53"/>
+      <w:bookmarkEnd w:id="55"/>
     </w:p>
     <w:p>
       <w:pPr>
@@ -21403,7 +21863,7 @@
           <w:u w:val="single"/>
         </w:rPr>
       </w:pPr>
-      <w:bookmarkStart w:id="54" w:name="_Toc226240778"/>
+      <w:bookmarkStart w:id="56" w:name="_Toc226412999"/>
       <w:r>
         <w:rPr>
           <w:rFonts w:ascii="Times New Roman" w:eastAsia="Times New Roman" w:hAnsi="Times New Roman" w:cs="Times New Roman"/>
@@ -21418,7 +21878,7 @@
         </w:rPr>
         <w:t> :</w:t>
       </w:r>
-      <w:bookmarkEnd w:id="54"/>
+      <w:bookmarkEnd w:id="56"/>
     </w:p>
     <w:p>
       <w:pPr>
@@ -21455,7 +21915,7 @@
           <w:lang w:eastAsia="fr-FR"/>
         </w:rPr>
       </w:pPr>
-      <w:bookmarkStart w:id="55" w:name="_Toc226240779"/>
+      <w:bookmarkStart w:id="57" w:name="_Toc226413000"/>
       <w:r>
         <w:rPr>
           <w:lang w:eastAsia="fr-FR"/>
@@ -21479,7 +21939,7 @@
         </w:rPr>
         <w:t>:</w:t>
       </w:r>
-      <w:bookmarkEnd w:id="55"/>
+      <w:bookmarkEnd w:id="57"/>
       <w:proofErr w:type="gramEnd"/>
     </w:p>
     <w:p>
@@ -21781,7 +22241,7 @@
           <w:rFonts w:eastAsia="Times New Roman"/>
         </w:rPr>
       </w:pPr>
-      <w:bookmarkStart w:id="56" w:name="_Toc226240780"/>
+      <w:bookmarkStart w:id="58" w:name="_Toc226413001"/>
       <w:r>
         <w:t>Système</w:t>
       </w:r>
@@ -21797,7 +22257,7 @@
         </w:rPr>
         <w:t> :</w:t>
       </w:r>
-      <w:bookmarkEnd w:id="56"/>
+      <w:bookmarkEnd w:id="58"/>
     </w:p>
     <w:p>
       <w:pPr>
@@ -22021,7 +22481,7 @@
           <w:rFonts w:eastAsia="Times New Roman"/>
         </w:rPr>
       </w:pPr>
-      <w:bookmarkStart w:id="57" w:name="_Toc226240781"/>
+      <w:bookmarkStart w:id="59" w:name="_Toc226413002"/>
       <w:r>
         <w:rPr>
           <w:rFonts w:eastAsia="Times New Roman"/>
@@ -22034,7 +22494,7 @@
         </w:rPr>
         <w:t> et adaptativité :</w:t>
       </w:r>
-      <w:bookmarkEnd w:id="57"/>
+      <w:bookmarkEnd w:id="59"/>
     </w:p>
     <w:p>
       <w:pPr>
@@ -22205,7 +22665,7 @@
           <w:u w:val="single"/>
         </w:rPr>
       </w:pPr>
-      <w:bookmarkStart w:id="58" w:name="_Toc226240782"/>
+      <w:bookmarkStart w:id="60" w:name="_Toc226413003"/>
       <w:r>
         <w:rPr>
           <w:rFonts w:ascii="Times New Roman" w:hAnsi="Times New Roman" w:cs="Times New Roman"/>
@@ -22213,7 +22673,7 @@
         </w:rPr>
         <w:t>Présentation des Résultats.</w:t>
       </w:r>
-      <w:bookmarkEnd w:id="58"/>
+      <w:bookmarkEnd w:id="60"/>
     </w:p>
     <w:p>
       <w:pPr>
@@ -22242,7 +22702,7 @@
           <w:numId w:val="54"/>
         </w:numPr>
       </w:pPr>
-      <w:bookmarkStart w:id="59" w:name="_Toc226240783"/>
+      <w:bookmarkStart w:id="61" w:name="_Toc226413004"/>
       <w:r>
         <w:lastRenderedPageBreak/>
         <w:t>Prototypage haute fidélité (Figma)</w:t>
@@ -22250,7 +22710,7 @@
       <w:r>
         <w:t> :</w:t>
       </w:r>
-      <w:bookmarkEnd w:id="59"/>
+      <w:bookmarkEnd w:id="61"/>
     </w:p>
     <w:p>
       <w:pPr>
@@ -22300,7 +22760,7 @@
                     <pic:cNvPicPr/>
                   </pic:nvPicPr>
                   <pic:blipFill>
-                    <a:blip r:embed="rId29" cstate="print">
+                    <a:blip r:embed="rId31" cstate="print">
                       <a:extLst>
                         <a:ext uri="{28A0092B-C50C-407E-A947-70E740481C1C}">
                           <a14:useLocalDpi xmlns:a14="http://schemas.microsoft.com/office/drawing/2010/main" val="0"/>
@@ -22337,7 +22797,7 @@
           <w:szCs w:val="24"/>
         </w:rPr>
       </w:pPr>
-      <w:bookmarkStart w:id="60" w:name="_Toc226240807"/>
+      <w:bookmarkStart w:id="62" w:name="_Toc226412955"/>
       <w:r>
         <w:t xml:space="preserve">Figure </w:t>
       </w:r>
@@ -22346,13 +22806,13 @@
           <w:rPr>
             <w:noProof/>
           </w:rPr>
-          <w:t>20</w:t>
+          <w:t>22</w:t>
         </w:r>
       </w:fldSimple>
       <w:r>
         <w:t>: Design sur Figma</w:t>
       </w:r>
-      <w:bookmarkEnd w:id="60"/>
+      <w:bookmarkEnd w:id="62"/>
     </w:p>
     <w:p>
       <w:pPr>
@@ -22362,14 +22822,14 @@
           <w:numId w:val="54"/>
         </w:numPr>
       </w:pPr>
-      <w:bookmarkStart w:id="61" w:name="_Toc226240784"/>
+      <w:bookmarkStart w:id="63" w:name="_Toc226413005"/>
       <w:r>
         <w:t>Rendu final de la plateforme web</w:t>
       </w:r>
       <w:r>
         <w:t> :</w:t>
       </w:r>
-      <w:bookmarkEnd w:id="61"/>
+      <w:bookmarkEnd w:id="63"/>
     </w:p>
     <w:p>
       <w:pPr>
@@ -22452,7 +22912,7 @@
                     <pic:cNvPicPr/>
                   </pic:nvPicPr>
                   <pic:blipFill>
-                    <a:blip r:embed="rId30" cstate="print">
+                    <a:blip r:embed="rId32" cstate="print">
                       <a:extLst>
                         <a:ext uri="{28A0092B-C50C-407E-A947-70E740481C1C}">
                           <a14:useLocalDpi xmlns:a14="http://schemas.microsoft.com/office/drawing/2010/main" val="0"/>
@@ -22489,7 +22949,7 @@
           <w:szCs w:val="24"/>
         </w:rPr>
       </w:pPr>
-      <w:bookmarkStart w:id="62" w:name="_Toc226240808"/>
+      <w:bookmarkStart w:id="64" w:name="_Toc226412956"/>
       <w:r>
         <w:t xml:space="preserve">Figure </w:t>
       </w:r>
@@ -22498,7 +22958,7 @@
           <w:rPr>
             <w:noProof/>
           </w:rPr>
-          <w:t>21</w:t>
+          <w:t>23</w:t>
         </w:r>
       </w:fldSimple>
       <w:r>
@@ -22521,7 +22981,7 @@
         </w:rPr>
         <w:t xml:space="preserve"> site</w:t>
       </w:r>
-      <w:bookmarkEnd w:id="62"/>
+      <w:bookmarkEnd w:id="64"/>
     </w:p>
     <w:p>
       <w:pPr>
@@ -22624,7 +23084,7 @@
                                 <w:noProof/>
                               </w:rPr>
                             </w:pPr>
-                            <w:bookmarkStart w:id="63" w:name="_Toc226240809"/>
+                            <w:bookmarkStart w:id="65" w:name="_Toc226412957"/>
                             <w:r>
                               <w:t xml:space="preserve">Figure </w:t>
                             </w:r>
@@ -22633,13 +23093,13 @@
                                 <w:rPr>
                                   <w:noProof/>
                                 </w:rPr>
-                                <w:t>22</w:t>
+                                <w:t>24</w:t>
                               </w:r>
                             </w:fldSimple>
                             <w:r>
                               <w:t>: Page du catalogue des voitures</w:t>
                             </w:r>
-                            <w:bookmarkEnd w:id="63"/>
+                            <w:bookmarkEnd w:id="65"/>
                           </w:p>
                         </w:txbxContent>
                       </wps:txbx>
@@ -22673,7 +23133,7 @@
                           <w:noProof/>
                         </w:rPr>
                       </w:pPr>
-                      <w:bookmarkStart w:id="64" w:name="_Toc226240809"/>
+                      <w:bookmarkStart w:id="66" w:name="_Toc226412957"/>
                       <w:r>
                         <w:t xml:space="preserve">Figure </w:t>
                       </w:r>
@@ -22682,13 +23142,13 @@
                           <w:rPr>
                             <w:noProof/>
                           </w:rPr>
-                          <w:t>22</w:t>
+                          <w:t>24</w:t>
                         </w:r>
                       </w:fldSimple>
                       <w:r>
                         <w:t>: Page du catalogue des voitures</w:t>
                       </w:r>
-                      <w:bookmarkEnd w:id="64"/>
+                      <w:bookmarkEnd w:id="66"/>
                     </w:p>
                   </w:txbxContent>
                 </v:textbox>
@@ -22737,7 +23197,7 @@
                     <pic:cNvPicPr/>
                   </pic:nvPicPr>
                   <pic:blipFill>
-                    <a:blip r:embed="rId31">
+                    <a:blip r:embed="rId33">
                       <a:extLst>
                         <a:ext uri="{28A0092B-C50C-407E-A947-70E740481C1C}">
                           <a14:useLocalDpi xmlns:a14="http://schemas.microsoft.com/office/drawing/2010/main" val="0"/>
@@ -22927,7 +23387,7 @@
                                 <w:szCs w:val="22"/>
                               </w:rPr>
                             </w:pPr>
-                            <w:bookmarkStart w:id="65" w:name="_Toc226240810"/>
+                            <w:bookmarkStart w:id="67" w:name="_Toc226412958"/>
                             <w:r>
                               <w:t xml:space="preserve">Figure </w:t>
                             </w:r>
@@ -22936,13 +23396,13 @@
                                 <w:rPr>
                                   <w:noProof/>
                                 </w:rPr>
-                                <w:t>23</w:t>
+                                <w:t>25</w:t>
                               </w:r>
                             </w:fldSimple>
                             <w:r>
                               <w:t>: Page du Dashboard</w:t>
                             </w:r>
-                            <w:bookmarkEnd w:id="65"/>
+                            <w:bookmarkEnd w:id="67"/>
                           </w:p>
                         </w:txbxContent>
                       </wps:txbx>
@@ -22973,7 +23433,7 @@
                           <w:szCs w:val="22"/>
                         </w:rPr>
                       </w:pPr>
-                      <w:bookmarkStart w:id="66" w:name="_Toc226240810"/>
+                      <w:bookmarkStart w:id="68" w:name="_Toc226412958"/>
                       <w:r>
                         <w:t xml:space="preserve">Figure </w:t>
                       </w:r>
@@ -22982,13 +23442,13 @@
                           <w:rPr>
                             <w:noProof/>
                           </w:rPr>
-                          <w:t>23</w:t>
+                          <w:t>25</w:t>
                         </w:r>
                       </w:fldSimple>
                       <w:r>
                         <w:t>: Page du Dashboard</w:t>
                       </w:r>
-                      <w:bookmarkEnd w:id="66"/>
+                      <w:bookmarkEnd w:id="68"/>
                     </w:p>
                   </w:txbxContent>
                 </v:textbox>
@@ -23034,7 +23494,7 @@
                     <pic:cNvPicPr/>
                   </pic:nvPicPr>
                   <pic:blipFill>
-                    <a:blip r:embed="rId32">
+                    <a:blip r:embed="rId34">
                       <a:extLst>
                         <a:ext uri="{28A0092B-C50C-407E-A947-70E740481C1C}">
                           <a14:useLocalDpi xmlns:a14="http://schemas.microsoft.com/office/drawing/2010/main" val="0"/>
@@ -23087,14 +23547,14 @@
           <w:numId w:val="54"/>
         </w:numPr>
       </w:pPr>
-      <w:bookmarkStart w:id="67" w:name="_Toc226240785"/>
+      <w:bookmarkStart w:id="69" w:name="_Toc226413006"/>
       <w:r>
         <w:t>Stratégie de communication visuelle (Instagram)</w:t>
       </w:r>
       <w:r>
         <w:t> :</w:t>
       </w:r>
-      <w:bookmarkEnd w:id="67"/>
+      <w:bookmarkEnd w:id="69"/>
     </w:p>
     <w:p>
       <w:pPr>
@@ -23283,7 +23743,7 @@
                     <pic:cNvPicPr/>
                   </pic:nvPicPr>
                   <pic:blipFill>
-                    <a:blip r:embed="rId33" cstate="print">
+                    <a:blip r:embed="rId35" cstate="print">
                       <a:extLst>
                         <a:ext uri="{28A0092B-C50C-407E-A947-70E740481C1C}">
                           <a14:useLocalDpi xmlns:a14="http://schemas.microsoft.com/office/drawing/2010/main" val="0"/>
@@ -23315,7 +23775,7 @@
         <w:pStyle w:val="Caption"/>
         <w:jc w:val="center"/>
       </w:pPr>
-      <w:bookmarkStart w:id="68" w:name="_Toc226240811"/>
+      <w:bookmarkStart w:id="70" w:name="_Toc226412959"/>
       <w:r>
         <w:t xml:space="preserve">Figure </w:t>
       </w:r>
@@ -23324,7 +23784,7 @@
           <w:rPr>
             <w:noProof/>
           </w:rPr>
-          <w:t>24</w:t>
+          <w:t>26</w:t>
         </w:r>
       </w:fldSimple>
       <w:r>
@@ -23336,7 +23796,7 @@
       <w:r>
         <w:t>1</w:t>
       </w:r>
-      <w:bookmarkEnd w:id="68"/>
+      <w:bookmarkEnd w:id="70"/>
     </w:p>
     <w:p>
       <w:pPr>
@@ -23391,7 +23851,7 @@
                     <pic:cNvPicPr/>
                   </pic:nvPicPr>
                   <pic:blipFill>
-                    <a:blip r:embed="rId34" cstate="print">
+                    <a:blip r:embed="rId36" cstate="print">
                       <a:extLst>
                         <a:ext uri="{28A0092B-C50C-407E-A947-70E740481C1C}">
                           <a14:useLocalDpi xmlns:a14="http://schemas.microsoft.com/office/drawing/2010/main" val="0"/>
@@ -23430,7 +23890,7 @@
           <w:szCs w:val="24"/>
         </w:rPr>
       </w:pPr>
-      <w:bookmarkStart w:id="69" w:name="_Toc226240812"/>
+      <w:bookmarkStart w:id="71" w:name="_Toc226412960"/>
       <w:r>
         <w:t xml:space="preserve">Figure </w:t>
       </w:r>
@@ -23439,13 +23899,13 @@
           <w:rPr>
             <w:noProof/>
           </w:rPr>
-          <w:t>25</w:t>
+          <w:t>27</w:t>
         </w:r>
       </w:fldSimple>
       <w:r>
         <w:t>: Post Instagram N° 2</w:t>
       </w:r>
-      <w:bookmarkEnd w:id="69"/>
+      <w:bookmarkEnd w:id="71"/>
     </w:p>
     <w:p>
       <w:pPr>
@@ -23568,7 +24028,7 @@
                     <pic:cNvPicPr/>
                   </pic:nvPicPr>
                   <pic:blipFill>
-                    <a:blip r:embed="rId35" cstate="print">
+                    <a:blip r:embed="rId37" cstate="print">
                       <a:extLst>
                         <a:ext uri="{28A0092B-C50C-407E-A947-70E740481C1C}">
                           <a14:useLocalDpi xmlns:a14="http://schemas.microsoft.com/office/drawing/2010/main" val="0"/>
@@ -23607,7 +24067,7 @@
           <w:szCs w:val="24"/>
         </w:rPr>
       </w:pPr>
-      <w:bookmarkStart w:id="70" w:name="_Toc226240813"/>
+      <w:bookmarkStart w:id="72" w:name="_Toc226412961"/>
       <w:r>
         <w:t xml:space="preserve">Figure </w:t>
       </w:r>
@@ -23616,13 +24076,13 @@
           <w:rPr>
             <w:noProof/>
           </w:rPr>
-          <w:t>26</w:t>
+          <w:t>28</w:t>
         </w:r>
       </w:fldSimple>
       <w:r>
         <w:t>: Post Instagram N° 3</w:t>
       </w:r>
-      <w:bookmarkEnd w:id="70"/>
+      <w:bookmarkEnd w:id="72"/>
     </w:p>
     <w:p>
       <w:pPr>
@@ -23693,7 +24153,7 @@
                     <pic:cNvPicPr/>
                   </pic:nvPicPr>
                   <pic:blipFill>
-                    <a:blip r:embed="rId36" cstate="print">
+                    <a:blip r:embed="rId38" cstate="print">
                       <a:extLst>
                         <a:ext uri="{28A0092B-C50C-407E-A947-70E740481C1C}">
                           <a14:useLocalDpi xmlns:a14="http://schemas.microsoft.com/office/drawing/2010/main" val="0"/>
@@ -23730,7 +24190,7 @@
           <w:szCs w:val="24"/>
         </w:rPr>
       </w:pPr>
-      <w:bookmarkStart w:id="71" w:name="_Toc226240814"/>
+      <w:bookmarkStart w:id="73" w:name="_Toc226412962"/>
       <w:r>
         <w:t xml:space="preserve">Figure </w:t>
       </w:r>
@@ -23739,13 +24199,13 @@
           <w:rPr>
             <w:noProof/>
           </w:rPr>
-          <w:t>27</w:t>
+          <w:t>29</w:t>
         </w:r>
       </w:fldSimple>
       <w:r>
         <w:t>: la Page Instagram</w:t>
       </w:r>
-      <w:bookmarkEnd w:id="71"/>
+      <w:bookmarkEnd w:id="73"/>
     </w:p>
     <w:p>
       <w:pPr>
@@ -23811,7 +24271,7 @@
                     <pic:cNvPicPr/>
                   </pic:nvPicPr>
                   <pic:blipFill>
-                    <a:blip r:embed="rId37" cstate="print">
+                    <a:blip r:embed="rId39" cstate="print">
                       <a:extLst>
                         <a:ext uri="{28A0092B-C50C-407E-A947-70E740481C1C}">
                           <a14:useLocalDpi xmlns:a14="http://schemas.microsoft.com/office/drawing/2010/main" val="0"/>
@@ -23850,7 +24310,7 @@
           <w:szCs w:val="24"/>
         </w:rPr>
       </w:pPr>
-      <w:bookmarkStart w:id="72" w:name="_Toc226240815"/>
+      <w:bookmarkStart w:id="74" w:name="_Toc226412963"/>
       <w:r>
         <w:t xml:space="preserve">Figure </w:t>
       </w:r>
@@ -23859,13 +24319,13 @@
           <w:rPr>
             <w:noProof/>
           </w:rPr>
-          <w:t>28</w:t>
+          <w:t>30</w:t>
         </w:r>
       </w:fldSimple>
       <w:r>
         <w:t>: Instagram Insights</w:t>
       </w:r>
-      <w:bookmarkEnd w:id="72"/>
+      <w:bookmarkEnd w:id="74"/>
     </w:p>
     <w:p>
       <w:pPr>
@@ -24048,7 +24508,7 @@
           <w:szCs w:val="32"/>
         </w:rPr>
       </w:pPr>
-      <w:bookmarkStart w:id="73" w:name="_Toc226240786"/>
+      <w:bookmarkStart w:id="75" w:name="_Toc226413007"/>
       <w:r>
         <w:rPr>
           <w:rFonts w:ascii="Times New Roman" w:hAnsi="Times New Roman" w:cs="Times New Roman"/>
@@ -24059,7 +24519,7 @@
         </w:rPr>
         <w:t>Conclusion</w:t>
       </w:r>
-      <w:bookmarkEnd w:id="73"/>
+      <w:bookmarkEnd w:id="75"/>
     </w:p>
     <w:p>
       <w:pPr>
@@ -24337,7 +24797,6 @@
           <w:lang w:val="en-US"/>
         </w:rPr>
       </w:pPr>
-      <w:bookmarkStart w:id="74" w:name="_Toc226240787"/>
     </w:p>
     <w:p>
       <w:pPr>
@@ -24353,6 +24812,7 @@
           <w:lang w:val="en-US"/>
         </w:rPr>
       </w:pPr>
+      <w:bookmarkStart w:id="76" w:name="_Toc226413008"/>
       <w:r>
         <w:rPr>
           <w:rFonts w:asciiTheme="majorBidi" w:hAnsiTheme="majorBidi"/>
@@ -24364,7 +24824,7 @@
         </w:rPr>
         <w:t>Bibliothèque</w:t>
       </w:r>
-      <w:bookmarkEnd w:id="74"/>
+      <w:bookmarkEnd w:id="76"/>
     </w:p>
     <w:p>
       <w:pPr>
@@ -24410,7 +24870,7 @@
         </w:rPr>
         <w:t xml:space="preserve"> </w:t>
       </w:r>
-      <w:hyperlink r:id="rId38" w:tgtFrame="_blank" w:history="1">
+      <w:hyperlink r:id="rId40" w:tgtFrame="_blank" w:history="1">
         <w:r>
           <w:rPr>
             <w:rStyle w:val="Hyperlink"/>
@@ -24468,7 +24928,7 @@
         </w:rPr>
         <w:t xml:space="preserve"> </w:t>
       </w:r>
-      <w:hyperlink r:id="rId39" w:tgtFrame="_blank" w:history="1">
+      <w:hyperlink r:id="rId41" w:tgtFrame="_blank" w:history="1">
         <w:r>
           <w:rPr>
             <w:rStyle w:val="Hyperlink"/>
@@ -24538,7 +24998,7 @@
         </w:rPr>
         <w:t xml:space="preserve"> </w:t>
       </w:r>
-      <w:hyperlink r:id="rId40" w:tgtFrame="_blank" w:history="1">
+      <w:hyperlink r:id="rId42" w:tgtFrame="_blank" w:history="1">
         <w:r>
           <w:rPr>
             <w:rStyle w:val="Hyperlink"/>
@@ -24596,7 +25056,7 @@
         </w:rPr>
         <w:t xml:space="preserve"> </w:t>
       </w:r>
-      <w:hyperlink r:id="rId41" w:tgtFrame="_blank" w:history="1">
+      <w:hyperlink r:id="rId43" w:tgtFrame="_blank" w:history="1">
         <w:r>
           <w:rPr>
             <w:rStyle w:val="Hyperlink"/>
@@ -24654,7 +25114,7 @@
         </w:rPr>
         <w:t xml:space="preserve"> </w:t>
       </w:r>
-      <w:hyperlink r:id="rId42" w:tgtFrame="_blank" w:history="1">
+      <w:hyperlink r:id="rId44" w:tgtFrame="_blank" w:history="1">
         <w:r>
           <w:rPr>
             <w:rStyle w:val="Hyperlink"/>
@@ -24766,7 +25226,7 @@
         </w:rPr>
         <w:t xml:space="preserve"> </w:t>
       </w:r>
-      <w:hyperlink r:id="rId43" w:history="1">
+      <w:hyperlink r:id="rId45" w:history="1">
         <w:r>
           <w:rPr>
             <w:rStyle w:val="Hyperlink"/>
@@ -24815,9 +25275,9 @@
       </w:pPr>
     </w:p>
     <w:sectPr>
-      <w:headerReference w:type="default" r:id="rId44"/>
-      <w:footerReference w:type="default" r:id="rId45"/>
-      <w:headerReference w:type="first" r:id="rId46"/>
+      <w:headerReference w:type="default" r:id="rId46"/>
+      <w:footerReference w:type="default" r:id="rId47"/>
+      <w:headerReference w:type="first" r:id="rId48"/>
       <w:pgSz w:w="11906" w:h="16838"/>
       <w:pgMar w:top="1417" w:right="1417" w:bottom="1417" w:left="1417" w:header="708" w:footer="708" w:gutter="0"/>
       <w:pgBorders w:offsetFrom="page">
@@ -33913,8 +34373,8 @@
     <w:rsid w:val="008952FA"/>
     <w:rsid w:val="00AC683E"/>
     <w:rsid w:val="00B047C3"/>
-    <w:rsid w:val="00BB7223"/>
     <w:rsid w:val="00DE2E35"/>
+    <w:rsid w:val="00DF047B"/>
     <w:rsid w:val="00DF392B"/>
   </w:rsids>
   <m:mathPr>

</xml_diff>